<commit_message>
Limita la propuesta a los cuatro experimentos criticos
Se retiran los dos experimentos de incertidumbre media (pasarela de pagos
nueva y continuidad offline movil) y se difieren al Proyecto Final 2, junto
con los de ramo nuevo y perdida de zona.

El programa queda en los cuatro puntos de sensibilidad de incertidumbre
alta: presupuesto de latencia, calibracion de la degradacion elegante,
absorcion de trafico ante la caida del cache y hermeticidad de la
tokenizacion. Total 42 horas, sin cambio, porque esas horas ya eran las
comprometidas para el Proyecto Final 1.

El criterio queda explicito en el documento: concentrar 42 horas en cuatro
experimentos que reducen incertidumbre real produce mas informacion que
repartirlas entre nueve y obtener mediciones superficiales en todos.
</commit_message>
<xml_diff>
--- a/documentos/semana-4/hoja_trabajo_semana4.docx
+++ b/documentos/semana-4/hoja_trabajo_semana4.docx
@@ -4357,7 +4357,7 @@
               <w:spacing w:before="20" w:after="20"/>
             </w:pPr>
             <w:r>
-              <w:t xml:space="preserve">Sí — EXP-05, prioridad menor</w:t>
+              <w:t xml:space="preserve">Se difiere al Proyecto Final 2</w:t>
             </w:r>
           </w:p>
         </w:tc>
@@ -4424,7 +4424,7 @@
               <w:spacing w:before="20" w:after="20"/>
             </w:pPr>
             <w:r>
-              <w:t xml:space="preserve">Sí — EXP-06, prioridad menor</w:t>
+              <w:t xml:space="preserve">Se difiere al Proyecto Final 2</w:t>
             </w:r>
           </w:p>
         </w:tc>
@@ -4667,7 +4667,7 @@
         <w:t xml:space="preserve">Sprint 1 de diseño.</w:t>
       </w:r>
       <w:r>
-        <w:t xml:space="preserve"> Los cuatro experimentos de incertidumbre alta conforman el Sprint 1 de diseño y se ejecutan en las semanas 5 y 6. Los de incertidumbre media se ejecutan si hay holgura.</w:t>
+        <w:t xml:space="preserve"> El programa de experimentación se limita deliberadamente a los cuatro puntos de sensibilidad de incertidumbre alta, que conforman el Sprint 1 de diseño y se ejecutan en las semanas 5 y 6. Los cinco puntos de sensibilidad restantes se difieren al Proyecto Final 2: concentrar las 42 horas disponibles en los cuatro experimentos que realmente reducen incertidumbre produce más información que repartirlas entre nueve.</w:t>
       </w:r>
     </w:p>
     <w:p>
@@ -9502,12 +9502,12 @@
         <w:pStyle w:val="Heading3"/>
       </w:pPr>
       <w:r>
-        <w:t xml:space="preserve">5.7 Experimentos de incertidumbre media</w:t>
-      </w:r>
-    </w:p>
-    <w:p>
-      <w:r>
-        <w:t xml:space="preserve">Los dos experimentos siguientes se ejecutan si el Sprint 1 de diseño deja holgura. Su incertidumbre es menor porque un resultado adverso obligaría a ajustar una abstracción, no a rehacer la estructura.</w:t>
+        <w:t xml:space="preserve">5.7 Ficha consolidada de tecnología</w:t>
+      </w:r>
+    </w:p>
+    <w:p>
+      <w:r>
+        <w:t xml:space="preserve">Esta es la tecnología completa requerida para ejecutar el Sprint 1 de diseño. La columna de familiaridad importa: donde el equipo no domina la herramienta, el esfuerzo estimado incluye el tiempo de aprendizaje.</w:t>
       </w:r>
     </w:p>
     <w:tbl>
@@ -9537,7 +9537,10 @@
               <w:spacing w:before="20" w:after="20"/>
             </w:pPr>
             <w:r>
-              <w:t/>
+              <w:rPr>
+                <w:b/>
+              </w:rPr>
+              <w:t xml:space="preserve">Categoría</w:t>
             </w:r>
           </w:p>
         </w:tc>
@@ -9554,7 +9557,7 @@
               <w:rPr>
                 <w:b/>
               </w:rPr>
-              <w:t xml:space="preserve">EXP-05</w:t>
+              <w:t xml:space="preserve">Tecnología</w:t>
             </w:r>
           </w:p>
         </w:tc>
@@ -9571,535 +9574,888 @@
               <w:rPr>
                 <w:b/>
               </w:rPr>
-              <w:t xml:space="preserve">EXP-06</w:t>
-            </w:r>
-          </w:p>
-        </w:tc>
-      </w:tr>
-      <w:tr>
-        <w:tc>
-          <w:tcPr>
-            <w:tcW w:w="0" w:type="auto"/>
-          </w:tcPr>
-          <w:p>
-            <w:pPr>
-              <w:spacing w:before="20" w:after="20"/>
-            </w:pPr>
-            <w:r>
-              <w:rPr>
-                <w:b/>
-              </w:rPr>
-              <w:t xml:space="preserve">Historia</w:t>
-            </w:r>
-          </w:p>
-        </w:tc>
-        <w:tc>
-          <w:tcPr>
-            <w:tcW w:w="0" w:type="auto"/>
-          </w:tcPr>
-          <w:p>
-            <w:pPr>
-              <w:spacing w:before="20" w:after="20"/>
-            </w:pPr>
-            <w:r>
-              <w:t xml:space="preserve">HU-ARQ-02 (SOL-20)</w:t>
-            </w:r>
-          </w:p>
-        </w:tc>
-        <w:tc>
-          <w:tcPr>
-            <w:tcW w:w="0" w:type="auto"/>
-          </w:tcPr>
-          <w:p>
-            <w:pPr>
-              <w:spacing w:before="20" w:after="20"/>
-            </w:pPr>
-            <w:r>
-              <w:t xml:space="preserve">HU-ARQ-10 (SOL-44)</w:t>
-            </w:r>
-          </w:p>
-        </w:tc>
-      </w:tr>
-      <w:tr>
-        <w:tc>
-          <w:tcPr>
-            <w:tcW w:w="0" w:type="auto"/>
-          </w:tcPr>
-          <w:p>
-            <w:pPr>
-              <w:spacing w:before="20" w:after="20"/>
-            </w:pPr>
-            <w:r>
-              <w:rPr>
-                <w:b/>
-              </w:rPr>
-              <w:t xml:space="preserve">ASR</w:t>
-            </w:r>
-          </w:p>
-        </w:tc>
-        <w:tc>
-          <w:tcPr>
-            <w:tcW w:w="0" w:type="auto"/>
-          </w:tcPr>
-          <w:p>
-            <w:pPr>
-              <w:spacing w:before="20" w:after="20"/>
-            </w:pPr>
-            <w:r>
-              <w:t xml:space="preserve">ASR-2.1</w:t>
-            </w:r>
-          </w:p>
-        </w:tc>
-        <w:tc>
-          <w:tcPr>
-            <w:tcW w:w="0" w:type="auto"/>
-          </w:tcPr>
-          <w:p>
-            <w:pPr>
-              <w:spacing w:before="20" w:after="20"/>
-            </w:pPr>
-            <w:r>
-              <w:t xml:space="preserve">ASR-3.3</w:t>
-            </w:r>
-          </w:p>
-        </w:tc>
-      </w:tr>
-      <w:tr>
-        <w:tc>
-          <w:tcPr>
-            <w:tcW w:w="0" w:type="auto"/>
-          </w:tcPr>
-          <w:p>
-            <w:pPr>
-              <w:spacing w:before="20" w:after="20"/>
-            </w:pPr>
-            <w:r>
-              <w:rPr>
-                <w:b/>
-              </w:rPr>
-              <w:t xml:space="preserve">Punto de sensibilidad</w:t>
-            </w:r>
-          </w:p>
-        </w:tc>
-        <w:tc>
-          <w:tcPr>
-            <w:tcW w:w="0" w:type="auto"/>
-          </w:tcPr>
-          <w:p>
-            <w:pPr>
-              <w:spacing w:before="20" w:after="20"/>
-            </w:pPr>
-            <w:r>
-              <w:t xml:space="preserve">Generalidad de la definición del puerto de pagos</w:t>
-            </w:r>
-          </w:p>
-        </w:tc>
-        <w:tc>
-          <w:tcPr>
-            <w:tcW w:w="0" w:type="auto"/>
-          </w:tcPr>
-          <w:p>
-            <w:pPr>
-              <w:spacing w:before="20" w:after="20"/>
-            </w:pPr>
-            <w:r>
-              <w:t xml:space="preserve">Protocolo de sincronización y resolución de conflictos</w:t>
-            </w:r>
-          </w:p>
-        </w:tc>
-      </w:tr>
-      <w:tr>
-        <w:tc>
-          <w:tcPr>
-            <w:tcW w:w="0" w:type="auto"/>
-          </w:tcPr>
-          <w:p>
-            <w:pPr>
-              <w:spacing w:before="20" w:after="20"/>
-            </w:pPr>
-            <w:r>
-              <w:rPr>
-                <w:b/>
-              </w:rPr>
-              <w:t xml:space="preserve">Propósito</w:t>
-            </w:r>
-          </w:p>
-        </w:tc>
-        <w:tc>
-          <w:tcPr>
-            <w:tcW w:w="0" w:type="auto"/>
-          </w:tcPr>
-          <w:p>
-            <w:pPr>
-              <w:spacing w:before="20" w:after="20"/>
-            </w:pPr>
-            <w:r>
-              <w:t xml:space="preserve">Medir empíricamente el costo de integrar una pasarela con contrato distinto, en vez de afirmarlo</w:t>
-            </w:r>
-          </w:p>
-        </w:tc>
-        <w:tc>
-          <w:tcPr>
-            <w:tcW w:w="0" w:type="auto"/>
-          </w:tcPr>
-          <w:p>
-            <w:pPr>
-              <w:spacing w:before="20" w:after="20"/>
-            </w:pPr>
-            <w:r>
-              <w:t xml:space="preserve">Verificar que la billetera funciona sin red y que la sincronización cumple el objetivo de tiempo</w:t>
-            </w:r>
-          </w:p>
-        </w:tc>
-      </w:tr>
-      <w:tr>
-        <w:tc>
-          <w:tcPr>
-            <w:tcW w:w="0" w:type="auto"/>
-          </w:tcPr>
-          <w:p>
-            <w:pPr>
-              <w:spacing w:before="20" w:after="20"/>
-            </w:pPr>
-            <w:r>
-              <w:rPr>
-                <w:b/>
-              </w:rPr>
-              <w:t xml:space="preserve">Patrón / táctica</w:t>
-            </w:r>
-          </w:p>
-        </w:tc>
-        <w:tc>
-          <w:tcPr>
-            <w:tcW w:w="0" w:type="auto"/>
-          </w:tcPr>
-          <w:p>
-            <w:pPr>
-              <w:spacing w:before="20" w:after="20"/>
-            </w:pPr>
-            <w:r>
-              <w:t xml:space="preserve">P5 · Inversión de dependencias, encapsular la variabilidad</w:t>
-            </w:r>
-          </w:p>
-        </w:tc>
-        <w:tc>
-          <w:tcPr>
-            <w:tcW w:w="0" w:type="auto"/>
-          </w:tcPr>
-          <w:p>
-            <w:pPr>
-              <w:spacing w:before="20" w:after="20"/>
-            </w:pPr>
-            <w:r>
-              <w:t xml:space="preserve">P7, P11 · Mantener copia local, sincronización diferida</w:t>
-            </w:r>
-          </w:p>
-        </w:tc>
-      </w:tr>
-      <w:tr>
-        <w:tc>
-          <w:tcPr>
-            <w:tcW w:w="0" w:type="auto"/>
-          </w:tcPr>
-          <w:p>
-            <w:pPr>
-              <w:spacing w:before="20" w:after="20"/>
-            </w:pPr>
-            <w:r>
-              <w:rPr>
-                <w:b/>
-              </w:rPr>
-              <w:t xml:space="preserve">Microservicios</w:t>
-            </w:r>
-          </w:p>
-        </w:tc>
-        <w:tc>
-          <w:tcPr>
-            <w:tcW w:w="0" w:type="auto"/>
-          </w:tcPr>
-          <w:p>
-            <w:pPr>
-              <w:spacing w:before="20" w:after="20"/>
-            </w:pPr>
-            <w:r>
-              <w:t xml:space="preserve">Pagos y Recaudo · adaptador de pasarela nuevo</w:t>
-            </w:r>
-          </w:p>
-        </w:tc>
-        <w:tc>
-          <w:tcPr>
-            <w:tcW w:w="0" w:type="auto"/>
-          </w:tcPr>
-          <w:p>
-            <w:pPr>
-              <w:spacing w:before="20" w:after="20"/>
-            </w:pPr>
-            <w:r>
-              <w:t xml:space="preserve">BFF Móvil · Pólizas</w:t>
-            </w:r>
-          </w:p>
-        </w:tc>
-      </w:tr>
-      <w:tr>
-        <w:tc>
-          <w:tcPr>
-            <w:tcW w:w="0" w:type="auto"/>
-          </w:tcPr>
-          <w:p>
-            <w:pPr>
-              <w:spacing w:before="20" w:after="20"/>
-            </w:pPr>
-            <w:r>
-              <w:rPr>
-                <w:b/>
-              </w:rPr>
-              <w:t xml:space="preserve">Conectores</w:t>
-            </w:r>
-          </w:p>
-        </w:tc>
-        <w:tc>
-          <w:tcPr>
-            <w:tcW w:w="0" w:type="auto"/>
-          </w:tcPr>
-          <w:p>
-            <w:pPr>
-              <w:spacing w:before="20" w:after="20"/>
-            </w:pPr>
-            <w:r>
-              <w:t xml:space="preserve">Puerto de dominio hacia el adaptador; adaptador hacia el simulador de pasarela</w:t>
-            </w:r>
-          </w:p>
-        </w:tc>
-        <w:tc>
-          <w:tcPr>
-            <w:tcW w:w="0" w:type="auto"/>
-          </w:tcPr>
-          <w:p>
-            <w:pPr>
-              <w:spacing w:before="20" w:after="20"/>
-            </w:pPr>
-            <w:r>
-              <w:t xml:space="preserve">Protocolo de sincronización entre app y BFF; almacenamiento local cifrado</w:t>
-            </w:r>
-          </w:p>
-        </w:tc>
-      </w:tr>
-      <w:tr>
-        <w:tc>
-          <w:tcPr>
-            <w:tcW w:w="0" w:type="auto"/>
-          </w:tcPr>
-          <w:p>
-            <w:pPr>
-              <w:spacing w:before="20" w:after="20"/>
-            </w:pPr>
-            <w:r>
-              <w:rPr>
-                <w:b/>
-              </w:rPr>
-              <w:t xml:space="preserve">Resultado esperado</w:t>
-            </w:r>
-          </w:p>
-        </w:tc>
-        <w:tc>
-          <w:tcPr>
-            <w:tcW w:w="0" w:type="auto"/>
-          </w:tcPr>
-          <w:p>
-            <w:pPr>
-              <w:spacing w:before="20" w:after="20"/>
-            </w:pPr>
-            <w:r>
-              <w:t xml:space="preserve">&lt; 4 horas-hombre · cero archivos del núcleo modificados</w:t>
-            </w:r>
-          </w:p>
-        </w:tc>
-        <w:tc>
-          <w:tcPr>
-            <w:tcW w:w="0" w:type="auto"/>
-          </w:tcPr>
-          <w:p>
-            <w:pPr>
-              <w:spacing w:before="20" w:after="20"/>
-            </w:pPr>
-            <w:r>
-              <w:t xml:space="preserve">100% de consultas sin red · sincronización ≤ 10 s</w:t>
-            </w:r>
-          </w:p>
-        </w:tc>
-      </w:tr>
-      <w:tr>
-        <w:tc>
-          <w:tcPr>
-            <w:tcW w:w="0" w:type="auto"/>
-          </w:tcPr>
-          <w:p>
-            <w:pPr>
-              <w:spacing w:before="20" w:after="20"/>
-            </w:pPr>
-            <w:r>
-              <w:rPr>
-                <w:b/>
-              </w:rPr>
-              <w:t xml:space="preserve">Refutación</w:t>
-            </w:r>
-          </w:p>
-        </w:tc>
-        <w:tc>
-          <w:tcPr>
-            <w:tcW w:w="0" w:type="auto"/>
-          </w:tcPr>
-          <w:p>
-            <w:pPr>
-              <w:spacing w:before="20" w:after="20"/>
-            </w:pPr>
-            <w:r>
-              <w:t xml:space="preserve">Cualquier archivo del núcleo modificado indica fuga de abstracción en el puerto</w:t>
-            </w:r>
-          </w:p>
-        </w:tc>
-        <w:tc>
-          <w:tcPr>
-            <w:tcW w:w="0" w:type="auto"/>
-          </w:tcPr>
-          <w:p>
-            <w:pPr>
-              <w:spacing w:before="20" w:after="20"/>
-            </w:pPr>
-            <w:r>
-              <w:t xml:space="preserve">Cualquier consulta que requiera red; sincronización por encima de 10 s</w:t>
-            </w:r>
-          </w:p>
-        </w:tc>
-      </w:tr>
-      <w:tr>
-        <w:tc>
-          <w:tcPr>
-            <w:tcW w:w="0" w:type="auto"/>
-          </w:tcPr>
-          <w:p>
-            <w:pPr>
-              <w:spacing w:before="20" w:after="20"/>
-            </w:pPr>
-            <w:r>
-              <w:rPr>
-                <w:b/>
-              </w:rPr>
-              <w:t xml:space="preserve">Decisión alternativa</w:t>
-            </w:r>
-          </w:p>
-        </w:tc>
-        <w:tc>
-          <w:tcPr>
-            <w:tcW w:w="0" w:type="auto"/>
-          </w:tcPr>
-          <w:p>
-            <w:pPr>
-              <w:spacing w:before="20" w:after="20"/>
-            </w:pPr>
-            <w:r>
-              <w:t xml:space="preserve">Redefinir el puerto en términos de intención de negocio y no de operaciones de pasarela</w:t>
-            </w:r>
-          </w:p>
-        </w:tc>
-        <w:tc>
-          <w:tcPr>
-            <w:tcW w:w="0" w:type="auto"/>
-          </w:tcPr>
-          <w:p>
-            <w:pPr>
-              <w:spacing w:before="20" w:after="20"/>
-            </w:pPr>
-            <w:r>
-              <w:t xml:space="preserve">Sincronización incremental por diferencias en lugar de por instantánea completa</w:t>
-            </w:r>
-          </w:p>
-        </w:tc>
-      </w:tr>
-      <w:tr>
-        <w:tc>
-          <w:tcPr>
-            <w:tcW w:w="0" w:type="auto"/>
-          </w:tcPr>
-          <w:p>
-            <w:pPr>
-              <w:spacing w:before="20" w:after="20"/>
-            </w:pPr>
-            <w:r>
-              <w:rPr>
-                <w:b/>
-              </w:rPr>
-              <w:t xml:space="preserve">Tecnología</w:t>
-            </w:r>
-          </w:p>
-        </w:tc>
-        <w:tc>
-          <w:tcPr>
-            <w:tcW w:w="0" w:type="auto"/>
-          </w:tcPr>
-          <w:p>
-            <w:pPr>
-              <w:spacing w:before="20" w:after="20"/>
-            </w:pPr>
-            <w:r>
-              <w:t xml:space="preserve">Registro de cambios por archivo · simulador de pasarela · cronometraje</w:t>
-            </w:r>
-          </w:p>
-        </w:tc>
-        <w:tc>
-          <w:tcPr>
-            <w:tcW w:w="0" w:type="auto"/>
-          </w:tcPr>
-          <w:p>
-            <w:pPr>
-              <w:spacing w:before="20" w:after="20"/>
-            </w:pPr>
-            <w:r>
-              <w:t xml:space="preserve">Emulador Android · Espresso · control de conectividad · inspección del almacenamiento local</w:t>
-            </w:r>
-          </w:p>
-        </w:tc>
-      </w:tr>
-      <w:tr>
-        <w:tc>
-          <w:tcPr>
-            <w:tcW w:w="0" w:type="auto"/>
-          </w:tcPr>
-          <w:p>
-            <w:pPr>
-              <w:spacing w:before="20" w:after="20"/>
-            </w:pPr>
-            <w:r>
-              <w:rPr>
-                <w:b/>
-              </w:rPr>
-              <w:t xml:space="preserve">Esfuerzo</w:t>
-            </w:r>
-          </w:p>
-        </w:tc>
-        <w:tc>
-          <w:tcPr>
-            <w:tcW w:w="0" w:type="auto"/>
-          </w:tcPr>
-          <w:p>
-            <w:pPr>
-              <w:spacing w:before="20" w:after="20"/>
-            </w:pPr>
-            <w:r>
-              <w:t xml:space="preserve">6 horas-hombre</w:t>
-            </w:r>
-          </w:p>
-        </w:tc>
-        <w:tc>
-          <w:tcPr>
-            <w:tcW w:w="0" w:type="auto"/>
-          </w:tcPr>
-          <w:p>
-            <w:pPr>
-              <w:spacing w:before="20" w:after="20"/>
-            </w:pPr>
-            <w:r>
-              <w:t xml:space="preserve">10 horas-hombre</w:t>
+              <w:t xml:space="preserve">Uso en los experimentos</w:t>
+            </w:r>
+          </w:p>
+        </w:tc>
+        <w:tc>
+          <w:tcPr>
+            <w:tcW w:w="0" w:type="auto"/>
+            <w:shd w:val="clear" w:fill="EDF2F7"/>
+          </w:tcPr>
+          <w:p>
+            <w:pPr>
+              <w:spacing w:before="20" w:after="20"/>
+            </w:pPr>
+            <w:r>
+              <w:rPr>
+                <w:b/>
+              </w:rPr>
+              <w:t xml:space="preserve">Familiaridad del equipo</w:t>
+            </w:r>
+          </w:p>
+        </w:tc>
+      </w:tr>
+      <w:tr>
+        <w:tc>
+          <w:tcPr>
+            <w:tcW w:w="0" w:type="auto"/>
+          </w:tcPr>
+          <w:p>
+            <w:pPr>
+              <w:spacing w:before="20" w:after="20"/>
+            </w:pPr>
+            <w:r>
+              <w:t xml:space="preserve">Lenguaje y marco</w:t>
+            </w:r>
+          </w:p>
+        </w:tc>
+        <w:tc>
+          <w:tcPr>
+            <w:tcW w:w="0" w:type="auto"/>
+          </w:tcPr>
+          <w:p>
+            <w:pPr>
+              <w:spacing w:before="20" w:after="20"/>
+            </w:pPr>
+            <w:r>
+              <w:t xml:space="preserve">Python 3.11 · Flask</w:t>
+            </w:r>
+          </w:p>
+        </w:tc>
+        <w:tc>
+          <w:tcPr>
+            <w:tcW w:w="0" w:type="auto"/>
+          </w:tcPr>
+          <w:p>
+            <w:pPr>
+              <w:spacing w:before="20" w:after="20"/>
+            </w:pPr>
+            <w:r>
+              <w:t xml:space="preserve">Implementación de los cuatro microservicios</w:t>
+            </w:r>
+          </w:p>
+        </w:tc>
+        <w:tc>
+          <w:tcPr>
+            <w:tcW w:w="0" w:type="auto"/>
+          </w:tcPr>
+          <w:p>
+            <w:pPr>
+              <w:spacing w:before="20" w:after="20"/>
+            </w:pPr>
+            <w:r>
+              <w:t xml:space="preserve">Alta</w:t>
+            </w:r>
+          </w:p>
+        </w:tc>
+      </w:tr>
+      <w:tr>
+        <w:tc>
+          <w:tcPr>
+            <w:tcW w:w="0" w:type="auto"/>
+          </w:tcPr>
+          <w:p>
+            <w:pPr>
+              <w:spacing w:before="20" w:after="20"/>
+            </w:pPr>
+            <w:r>
+              <w:t xml:space="preserve">Servidor de aplicación</w:t>
+            </w:r>
+          </w:p>
+        </w:tc>
+        <w:tc>
+          <w:tcPr>
+            <w:tcW w:w="0" w:type="auto"/>
+          </w:tcPr>
+          <w:p>
+            <w:pPr>
+              <w:spacing w:before="20" w:after="20"/>
+            </w:pPr>
+            <w:r>
+              <w:t xml:space="preserve">Gunicorn con trabajadores concurrentes</w:t>
+            </w:r>
+          </w:p>
+        </w:tc>
+        <w:tc>
+          <w:tcPr>
+            <w:tcW w:w="0" w:type="auto"/>
+          </w:tcPr>
+          <w:p>
+            <w:pPr>
+              <w:spacing w:before="20" w:after="20"/>
+            </w:pPr>
+            <w:r>
+              <w:t xml:space="preserve">Servir los microservicios bajo carga</w:t>
+            </w:r>
+          </w:p>
+        </w:tc>
+        <w:tc>
+          <w:tcPr>
+            <w:tcW w:w="0" w:type="auto"/>
+          </w:tcPr>
+          <w:p>
+            <w:pPr>
+              <w:spacing w:before="20" w:after="20"/>
+            </w:pPr>
+            <w:r>
+              <w:t xml:space="preserve">Media</w:t>
+            </w:r>
+          </w:p>
+        </w:tc>
+      </w:tr>
+      <w:tr>
+        <w:tc>
+          <w:tcPr>
+            <w:tcW w:w="0" w:type="auto"/>
+          </w:tcPr>
+          <w:p>
+            <w:pPr>
+              <w:spacing w:before="20" w:after="20"/>
+            </w:pPr>
+            <w:r>
+              <w:t xml:space="preserve">Base de datos</w:t>
+            </w:r>
+          </w:p>
+        </w:tc>
+        <w:tc>
+          <w:tcPr>
+            <w:tcW w:w="0" w:type="auto"/>
+          </w:tcPr>
+          <w:p>
+            <w:pPr>
+              <w:spacing w:before="20" w:after="20"/>
+            </w:pPr>
+            <w:r>
+              <w:t xml:space="preserve">PostgreSQL 15</w:t>
+            </w:r>
+          </w:p>
+        </w:tc>
+        <w:tc>
+          <w:tcPr>
+            <w:tcW w:w="0" w:type="auto"/>
+          </w:tcPr>
+          <w:p>
+            <w:pPr>
+              <w:spacing w:before="20" w:after="20"/>
+            </w:pPr>
+            <w:r>
+              <w:t xml:space="preserve">Persistencia transaccional; fuente de respaldo en EXP-03</w:t>
+            </w:r>
+          </w:p>
+        </w:tc>
+        <w:tc>
+          <w:tcPr>
+            <w:tcW w:w="0" w:type="auto"/>
+          </w:tcPr>
+          <w:p>
+            <w:pPr>
+              <w:spacing w:before="20" w:after="20"/>
+            </w:pPr>
+            <w:r>
+              <w:t xml:space="preserve">Alta</w:t>
+            </w:r>
+          </w:p>
+        </w:tc>
+      </w:tr>
+      <w:tr>
+        <w:tc>
+          <w:tcPr>
+            <w:tcW w:w="0" w:type="auto"/>
+          </w:tcPr>
+          <w:p>
+            <w:pPr>
+              <w:spacing w:before="20" w:after="20"/>
+            </w:pPr>
+            <w:r>
+              <w:t xml:space="preserve">Caché</w:t>
+            </w:r>
+          </w:p>
+        </w:tc>
+        <w:tc>
+          <w:tcPr>
+            <w:tcW w:w="0" w:type="auto"/>
+          </w:tcPr>
+          <w:p>
+            <w:pPr>
+              <w:spacing w:before="20" w:after="20"/>
+            </w:pPr>
+            <w:r>
+              <w:t xml:space="preserve">Redis 7</w:t>
+            </w:r>
+          </w:p>
+        </w:tc>
+        <w:tc>
+          <w:tcPr>
+            <w:tcW w:w="0" w:type="auto"/>
+          </w:tcPr>
+          <w:p>
+            <w:pPr>
+              <w:spacing w:before="20" w:after="20"/>
+            </w:pPr>
+            <w:r>
+              <w:t xml:space="preserve">Perfiles de riesgo; objeto de la falla inducida en EXP-03</w:t>
+            </w:r>
+          </w:p>
+        </w:tc>
+        <w:tc>
+          <w:tcPr>
+            <w:tcW w:w="0" w:type="auto"/>
+          </w:tcPr>
+          <w:p>
+            <w:pPr>
+              <w:spacing w:before="20" w:after="20"/>
+            </w:pPr>
+            <w:r>
+              <w:t xml:space="preserve">Media</w:t>
+            </w:r>
+          </w:p>
+        </w:tc>
+      </w:tr>
+      <w:tr>
+        <w:tc>
+          <w:tcPr>
+            <w:tcW w:w="0" w:type="auto"/>
+          </w:tcPr>
+          <w:p>
+            <w:pPr>
+              <w:spacing w:before="20" w:after="20"/>
+            </w:pPr>
+            <w:r>
+              <w:t xml:space="preserve">Bus de eventos</w:t>
+            </w:r>
+          </w:p>
+        </w:tc>
+        <w:tc>
+          <w:tcPr>
+            <w:tcW w:w="0" w:type="auto"/>
+          </w:tcPr>
+          <w:p>
+            <w:pPr>
+              <w:spacing w:before="20" w:after="20"/>
+            </w:pPr>
+            <w:r>
+              <w:t xml:space="preserve">Kafka 3.x en modo sin coordinador externo</w:t>
+            </w:r>
+          </w:p>
+        </w:tc>
+        <w:tc>
+          <w:tcPr>
+            <w:tcW w:w="0" w:type="auto"/>
+          </w:tcPr>
+          <w:p>
+            <w:pPr>
+              <w:spacing w:before="20" w:after="20"/>
+            </w:pPr>
+            <w:r>
+              <w:t xml:space="preserve">Inspección de mensajes en EXP-04</w:t>
+            </w:r>
+          </w:p>
+        </w:tc>
+        <w:tc>
+          <w:tcPr>
+            <w:tcW w:w="0" w:type="auto"/>
+          </w:tcPr>
+          <w:p>
+            <w:pPr>
+              <w:spacing w:before="20" w:after="20"/>
+            </w:pPr>
+            <w:r>
+              <w:t xml:space="preserve">Baja — se reserva tiempo de aprendizaje</w:t>
+            </w:r>
+          </w:p>
+        </w:tc>
+      </w:tr>
+      <w:tr>
+        <w:tc>
+          <w:tcPr>
+            <w:tcW w:w="0" w:type="auto"/>
+          </w:tcPr>
+          <w:p>
+            <w:pPr>
+              <w:spacing w:before="20" w:after="20"/>
+            </w:pPr>
+            <w:r>
+              <w:t xml:space="preserve">Cliente de base de datos</w:t>
+            </w:r>
+          </w:p>
+        </w:tc>
+        <w:tc>
+          <w:tcPr>
+            <w:tcW w:w="0" w:type="auto"/>
+          </w:tcPr>
+          <w:p>
+            <w:pPr>
+              <w:spacing w:before="20" w:after="20"/>
+            </w:pPr>
+            <w:r>
+              <w:t xml:space="preserve">psycopg con depósito de conexiones</w:t>
+            </w:r>
+          </w:p>
+        </w:tc>
+        <w:tc>
+          <w:tcPr>
+            <w:tcW w:w="0" w:type="auto"/>
+          </w:tcPr>
+          <w:p>
+            <w:pPr>
+              <w:spacing w:before="20" w:after="20"/>
+            </w:pPr>
+            <w:r>
+              <w:t xml:space="preserve">Conectores hacia PostgreSQL; aislamiento por mamparo</w:t>
+            </w:r>
+          </w:p>
+        </w:tc>
+        <w:tc>
+          <w:tcPr>
+            <w:tcW w:w="0" w:type="auto"/>
+          </w:tcPr>
+          <w:p>
+            <w:pPr>
+              <w:spacing w:before="20" w:after="20"/>
+            </w:pPr>
+            <w:r>
+              <w:t xml:space="preserve">Alta</w:t>
+            </w:r>
+          </w:p>
+        </w:tc>
+      </w:tr>
+      <w:tr>
+        <w:tc>
+          <w:tcPr>
+            <w:tcW w:w="0" w:type="auto"/>
+          </w:tcPr>
+          <w:p>
+            <w:pPr>
+              <w:spacing w:before="20" w:after="20"/>
+            </w:pPr>
+            <w:r>
+              <w:t xml:space="preserve">Cliente de caché</w:t>
+            </w:r>
+          </w:p>
+        </w:tc>
+        <w:tc>
+          <w:tcPr>
+            <w:tcW w:w="0" w:type="auto"/>
+          </w:tcPr>
+          <w:p>
+            <w:pPr>
+              <w:spacing w:before="20" w:after="20"/>
+            </w:pPr>
+            <w:r>
+              <w:t xml:space="preserve">redis-py con depósito</w:t>
+            </w:r>
+          </w:p>
+        </w:tc>
+        <w:tc>
+          <w:tcPr>
+            <w:tcW w:w="0" w:type="auto"/>
+          </w:tcPr>
+          <w:p>
+            <w:pPr>
+              <w:spacing w:before="20" w:after="20"/>
+            </w:pPr>
+            <w:r>
+              <w:t xml:space="preserve">Conector hacia Redis</w:t>
+            </w:r>
+          </w:p>
+        </w:tc>
+        <w:tc>
+          <w:tcPr>
+            <w:tcW w:w="0" w:type="auto"/>
+          </w:tcPr>
+          <w:p>
+            <w:pPr>
+              <w:spacing w:before="20" w:after="20"/>
+            </w:pPr>
+            <w:r>
+              <w:t xml:space="preserve">Media</w:t>
+            </w:r>
+          </w:p>
+        </w:tc>
+      </w:tr>
+      <w:tr>
+        <w:tc>
+          <w:tcPr>
+            <w:tcW w:w="0" w:type="auto"/>
+          </w:tcPr>
+          <w:p>
+            <w:pPr>
+              <w:spacing w:before="20" w:after="20"/>
+            </w:pPr>
+            <w:r>
+              <w:t xml:space="preserve">Cliente HTTP</w:t>
+            </w:r>
+          </w:p>
+        </w:tc>
+        <w:tc>
+          <w:tcPr>
+            <w:tcW w:w="0" w:type="auto"/>
+          </w:tcPr>
+          <w:p>
+            <w:pPr>
+              <w:spacing w:before="20" w:after="20"/>
+            </w:pPr>
+            <w:r>
+              <w:t xml:space="preserve">httpx con depósito y tiempo de espera</w:t>
+            </w:r>
+          </w:p>
+        </w:tc>
+        <w:tc>
+          <w:tcPr>
+            <w:tcW w:w="0" w:type="auto"/>
+          </w:tcPr>
+          <w:p>
+            <w:pPr>
+              <w:spacing w:before="20" w:after="20"/>
+            </w:pPr>
+            <w:r>
+              <w:t xml:space="preserve">Adaptadores hacia proveedores externos</w:t>
+            </w:r>
+          </w:p>
+        </w:tc>
+        <w:tc>
+          <w:tcPr>
+            <w:tcW w:w="0" w:type="auto"/>
+          </w:tcPr>
+          <w:p>
+            <w:pPr>
+              <w:spacing w:before="20" w:after="20"/>
+            </w:pPr>
+            <w:r>
+              <w:t xml:space="preserve">Alta</w:t>
+            </w:r>
+          </w:p>
+        </w:tc>
+      </w:tr>
+      <w:tr>
+        <w:tc>
+          <w:tcPr>
+            <w:tcW w:w="0" w:type="auto"/>
+          </w:tcPr>
+          <w:p>
+            <w:pPr>
+              <w:spacing w:before="20" w:after="20"/>
+            </w:pPr>
+            <w:r>
+              <w:t xml:space="preserve">Interruptor de circuito</w:t>
+            </w:r>
+          </w:p>
+        </w:tc>
+        <w:tc>
+          <w:tcPr>
+            <w:tcW w:w="0" w:type="auto"/>
+          </w:tcPr>
+          <w:p>
+            <w:pPr>
+              <w:spacing w:before="20" w:after="20"/>
+            </w:pPr>
+            <w:r>
+              <w:t xml:space="preserve">pybreaker</w:t>
+            </w:r>
+          </w:p>
+        </w:tc>
+        <w:tc>
+          <w:tcPr>
+            <w:tcW w:w="0" w:type="auto"/>
+          </w:tcPr>
+          <w:p>
+            <w:pPr>
+              <w:spacing w:before="20" w:after="20"/>
+            </w:pPr>
+            <w:r>
+              <w:t xml:space="preserve">Mecanismo bajo prueba en EXP-02</w:t>
+            </w:r>
+          </w:p>
+        </w:tc>
+        <w:tc>
+          <w:tcPr>
+            <w:tcW w:w="0" w:type="auto"/>
+          </w:tcPr>
+          <w:p>
+            <w:pPr>
+              <w:spacing w:before="20" w:after="20"/>
+            </w:pPr>
+            <w:r>
+              <w:t xml:space="preserve">Baja — se reserva tiempo de aprendizaje</w:t>
+            </w:r>
+          </w:p>
+        </w:tc>
+      </w:tr>
+      <w:tr>
+        <w:tc>
+          <w:tcPr>
+            <w:tcW w:w="0" w:type="auto"/>
+          </w:tcPr>
+          <w:p>
+            <w:pPr>
+              <w:spacing w:before="20" w:after="20"/>
+            </w:pPr>
+            <w:r>
+              <w:t xml:space="preserve">Orquestación local</w:t>
+            </w:r>
+          </w:p>
+        </w:tc>
+        <w:tc>
+          <w:tcPr>
+            <w:tcW w:w="0" w:type="auto"/>
+          </w:tcPr>
+          <w:p>
+            <w:pPr>
+              <w:spacing w:before="20" w:after="20"/>
+            </w:pPr>
+            <w:r>
+              <w:t xml:space="preserve">Docker · Docker Compose</w:t>
+            </w:r>
+          </w:p>
+        </w:tc>
+        <w:tc>
+          <w:tcPr>
+            <w:tcW w:w="0" w:type="auto"/>
+          </w:tcPr>
+          <w:p>
+            <w:pPr>
+              <w:spacing w:before="20" w:after="20"/>
+            </w:pPr>
+            <w:r>
+              <w:t xml:space="preserve">Entorno completo de los experimentos</w:t>
+            </w:r>
+          </w:p>
+        </w:tc>
+        <w:tc>
+          <w:tcPr>
+            <w:tcW w:w="0" w:type="auto"/>
+          </w:tcPr>
+          <w:p>
+            <w:pPr>
+              <w:spacing w:before="20" w:after="20"/>
+            </w:pPr>
+            <w:r>
+              <w:t xml:space="preserve">Alta</w:t>
+            </w:r>
+          </w:p>
+        </w:tc>
+      </w:tr>
+      <w:tr>
+        <w:tc>
+          <w:tcPr>
+            <w:tcW w:w="0" w:type="auto"/>
+          </w:tcPr>
+          <w:p>
+            <w:pPr>
+              <w:spacing w:before="20" w:after="20"/>
+            </w:pPr>
+            <w:r>
+              <w:t xml:space="preserve">Generación de carga</w:t>
+            </w:r>
+          </w:p>
+        </w:tc>
+        <w:tc>
+          <w:tcPr>
+            <w:tcW w:w="0" w:type="auto"/>
+          </w:tcPr>
+          <w:p>
+            <w:pPr>
+              <w:spacing w:before="20" w:after="20"/>
+            </w:pPr>
+            <w:r>
+              <w:t xml:space="preserve">Apache JMeter</w:t>
+            </w:r>
+          </w:p>
+        </w:tc>
+        <w:tc>
+          <w:tcPr>
+            <w:tcW w:w="0" w:type="auto"/>
+          </w:tcPr>
+          <w:p>
+            <w:pPr>
+              <w:spacing w:before="20" w:after="20"/>
+            </w:pPr>
+            <w:r>
+              <w:t xml:space="preserve">Carga y medición de percentiles en EXP-01, 02 y 03</w:t>
+            </w:r>
+          </w:p>
+        </w:tc>
+        <w:tc>
+          <w:tcPr>
+            <w:tcW w:w="0" w:type="auto"/>
+          </w:tcPr>
+          <w:p>
+            <w:pPr>
+              <w:spacing w:before="20" w:after="20"/>
+            </w:pPr>
+            <w:r>
+              <w:t xml:space="preserve">Media</w:t>
+            </w:r>
+          </w:p>
+        </w:tc>
+      </w:tr>
+      <w:tr>
+        <w:tc>
+          <w:tcPr>
+            <w:tcW w:w="0" w:type="auto"/>
+          </w:tcPr>
+          <w:p>
+            <w:pPr>
+              <w:spacing w:before="20" w:after="20"/>
+            </w:pPr>
+            <w:r>
+              <w:t xml:space="preserve">Simulación de dependencias</w:t>
+            </w:r>
+          </w:p>
+        </w:tc>
+        <w:tc>
+          <w:tcPr>
+            <w:tcW w:w="0" w:type="auto"/>
+          </w:tcPr>
+          <w:p>
+            <w:pPr>
+              <w:spacing w:before="20" w:after="20"/>
+            </w:pPr>
+            <w:r>
+              <w:t xml:space="preserve">Simulador HTTP con latencia controlada</w:t>
+            </w:r>
+          </w:p>
+        </w:tc>
+        <w:tc>
+          <w:tcPr>
+            <w:tcW w:w="0" w:type="auto"/>
+          </w:tcPr>
+          <w:p>
+            <w:pPr>
+              <w:spacing w:before="20" w:after="20"/>
+            </w:pPr>
+            <w:r>
+              <w:t xml:space="preserve">Open Finance degradado en EXP-01 y 02</w:t>
+            </w:r>
+          </w:p>
+        </w:tc>
+        <w:tc>
+          <w:tcPr>
+            <w:tcW w:w="0" w:type="auto"/>
+          </w:tcPr>
+          <w:p>
+            <w:pPr>
+              <w:spacing w:before="20" w:after="20"/>
+            </w:pPr>
+            <w:r>
+              <w:t xml:space="preserve">Media</w:t>
+            </w:r>
+          </w:p>
+        </w:tc>
+      </w:tr>
+      <w:tr>
+        <w:tc>
+          <w:tcPr>
+            <w:tcW w:w="0" w:type="auto"/>
+          </w:tcPr>
+          <w:p>
+            <w:pPr>
+              <w:spacing w:before="20" w:after="20"/>
+            </w:pPr>
+            <w:r>
+              <w:t xml:space="preserve">Trazas distribuidas</w:t>
+            </w:r>
+          </w:p>
+        </w:tc>
+        <w:tc>
+          <w:tcPr>
+            <w:tcW w:w="0" w:type="auto"/>
+          </w:tcPr>
+          <w:p>
+            <w:pPr>
+              <w:spacing w:before="20" w:after="20"/>
+            </w:pPr>
+            <w:r>
+              <w:t xml:space="preserve">Instrumentación de trazas por salto</w:t>
+            </w:r>
+          </w:p>
+        </w:tc>
+        <w:tc>
+          <w:tcPr>
+            <w:tcW w:w="0" w:type="auto"/>
+          </w:tcPr>
+          <w:p>
+            <w:pPr>
+              <w:spacing w:before="20" w:after="20"/>
+            </w:pPr>
+            <w:r>
+              <w:t xml:space="preserve">Atribución de latencia por componente</w:t>
+            </w:r>
+          </w:p>
+        </w:tc>
+        <w:tc>
+          <w:tcPr>
+            <w:tcW w:w="0" w:type="auto"/>
+          </w:tcPr>
+          <w:p>
+            <w:pPr>
+              <w:spacing w:before="20" w:after="20"/>
+            </w:pPr>
+            <w:r>
+              <w:t xml:space="preserve">Baja — se reserva tiempo de aprendizaje</w:t>
+            </w:r>
+          </w:p>
+        </w:tc>
+      </w:tr>
+      <w:tr>
+        <w:tc>
+          <w:tcPr>
+            <w:tcW w:w="0" w:type="auto"/>
+          </w:tcPr>
+          <w:p>
+            <w:pPr>
+              <w:spacing w:before="20" w:after="20"/>
+            </w:pPr>
+            <w:r>
+              <w:t xml:space="preserve">Seguridad</w:t>
+            </w:r>
+          </w:p>
+        </w:tc>
+        <w:tc>
+          <w:tcPr>
+            <w:tcW w:w="0" w:type="auto"/>
+          </w:tcPr>
+          <w:p>
+            <w:pPr>
+              <w:spacing w:before="20" w:after="20"/>
+            </w:pPr>
+            <w:r>
+              <w:t xml:space="preserve">OWASP ZAP</w:t>
+            </w:r>
+          </w:p>
+        </w:tc>
+        <w:tc>
+          <w:tcPr>
+            <w:tcW w:w="0" w:type="auto"/>
+          </w:tcPr>
+          <w:p>
+            <w:pPr>
+              <w:spacing w:before="20" w:after="20"/>
+            </w:pPr>
+            <w:r>
+              <w:t xml:space="preserve">Verificación de TLS en EXP-04</w:t>
+            </w:r>
+          </w:p>
+        </w:tc>
+        <w:tc>
+          <w:tcPr>
+            <w:tcW w:w="0" w:type="auto"/>
+          </w:tcPr>
+          <w:p>
+            <w:pPr>
+              <w:spacing w:before="20" w:after="20"/>
+            </w:pPr>
+            <w:r>
+              <w:t xml:space="preserve">Media</w:t>
+            </w:r>
+          </w:p>
+        </w:tc>
+      </w:tr>
+      <w:tr>
+        <w:tc>
+          <w:tcPr>
+            <w:tcW w:w="0" w:type="auto"/>
+          </w:tcPr>
+          <w:p>
+            <w:pPr>
+              <w:spacing w:before="20" w:after="20"/>
+            </w:pPr>
+            <w:r>
+              <w:t xml:space="preserve">Inspección de datos</w:t>
+            </w:r>
+          </w:p>
+        </w:tc>
+        <w:tc>
+          <w:tcPr>
+            <w:tcW w:w="0" w:type="auto"/>
+          </w:tcPr>
+          <w:p>
+            <w:pPr>
+              <w:spacing w:before="20" w:after="20"/>
+            </w:pPr>
+            <w:r>
+              <w:t xml:space="preserve">Consultas de verificación · consumidor de inspección de temas</w:t>
+            </w:r>
+          </w:p>
+        </w:tc>
+        <w:tc>
+          <w:tcPr>
+            <w:tcW w:w="0" w:type="auto"/>
+          </w:tcPr>
+          <w:p>
+            <w:pPr>
+              <w:spacing w:before="20" w:after="20"/>
+            </w:pPr>
+            <w:r>
+              <w:t xml:space="preserve">Búsqueda de datos cebo en EXP-04</w:t>
+            </w:r>
+          </w:p>
+        </w:tc>
+        <w:tc>
+          <w:tcPr>
+            <w:tcW w:w="0" w:type="auto"/>
+          </w:tcPr>
+          <w:p>
+            <w:pPr>
+              <w:spacing w:before="20" w:after="20"/>
+            </w:pPr>
+            <w:r>
+              <w:t xml:space="preserve">Alta</w:t>
+            </w:r>
+          </w:p>
+        </w:tc>
+      </w:tr>
+      <w:tr>
+        <w:tc>
+          <w:tcPr>
+            <w:tcW w:w="0" w:type="auto"/>
+          </w:tcPr>
+          <w:p>
+            <w:pPr>
+              <w:spacing w:before="20" w:after="20"/>
+            </w:pPr>
+            <w:r>
+              <w:t xml:space="preserve">Cifrado y llaves</w:t>
+            </w:r>
+          </w:p>
+        </w:tc>
+        <w:tc>
+          <w:tcPr>
+            <w:tcW w:w="0" w:type="auto"/>
+          </w:tcPr>
+          <w:p>
+            <w:pPr>
+              <w:spacing w:before="20" w:after="20"/>
+            </w:pPr>
+            <w:r>
+              <w:t xml:space="preserve">Servicio de gestión de llaves</w:t>
+            </w:r>
+          </w:p>
+        </w:tc>
+        <w:tc>
+          <w:tcPr>
+            <w:tcW w:w="0" w:type="auto"/>
+          </w:tcPr>
+          <w:p>
+            <w:pPr>
+              <w:spacing w:before="20" w:after="20"/>
+            </w:pPr>
+            <w:r>
+              <w:t xml:space="preserve">Cifrado del dato custodiado en EXP-04</w:t>
+            </w:r>
+          </w:p>
+        </w:tc>
+        <w:tc>
+          <w:tcPr>
+            <w:tcW w:w="0" w:type="auto"/>
+          </w:tcPr>
+          <w:p>
+            <w:pPr>
+              <w:spacing w:before="20" w:after="20"/>
+            </w:pPr>
+            <w:r>
+              <w:t xml:space="preserve">Baja — se reserva tiempo de aprendizaje</w:t>
             </w:r>
           </w:p>
         </w:tc>
@@ -10115,12 +10471,12 @@
         <w:pStyle w:val="Heading3"/>
       </w:pPr>
       <w:r>
-        <w:t xml:space="preserve">5.8 Ficha consolidada de tecnología</w:t>
-      </w:r>
-    </w:p>
-    <w:p>
-      <w:r>
-        <w:t xml:space="preserve">Esta es la tecnología completa requerida para ejecutar el Sprint 1 de diseño. La columna de familiaridad importa: donde el equipo no domina la herramienta, el esfuerzo estimado incluye el tiempo de aprendizaje.</w:t>
+        <w:t xml:space="preserve">5.8 Distribución de actividades por integrante</w:t>
+      </w:r>
+    </w:p>
+    <w:p>
+      <w:r>
+        <w:t xml:space="preserve">Las 42 horas del Sprint 1 de diseño se reparten de forma equitativa entre los cuatro integrantes, asignando a cada uno las actividades más cercanas a su rol pero sin dejar a nadie fuera de la construcción.</w:t>
       </w:r>
     </w:p>
     <w:tbl>
@@ -10153,7 +10509,7 @@
               <w:rPr>
                 <w:b/>
               </w:rPr>
-              <w:t xml:space="preserve">Categoría</w:t>
+              <w:t xml:space="preserve">Integrante</w:t>
             </w:r>
           </w:p>
         </w:tc>
@@ -10170,7 +10526,7 @@
               <w:rPr>
                 <w:b/>
               </w:rPr>
-              <w:t xml:space="preserve">Tecnología</w:t>
+              <w:t xml:space="preserve">Actividades asignadas</w:t>
             </w:r>
           </w:p>
         </w:tc>
@@ -10187,7 +10543,7 @@
               <w:rPr>
                 <w:b/>
               </w:rPr>
-              <w:t xml:space="preserve">Uso en los experimentos</w:t>
+              <w:t xml:space="preserve">Experimentos</w:t>
             </w:r>
           </w:p>
         </w:tc>
@@ -10204,871 +10560,295 @@
               <w:rPr>
                 <w:b/>
               </w:rPr>
-              <w:t xml:space="preserve">Familiaridad del equipo</w:t>
-            </w:r>
-          </w:p>
-        </w:tc>
-      </w:tr>
-      <w:tr>
-        <w:tc>
-          <w:tcPr>
-            <w:tcW w:w="0" w:type="auto"/>
-          </w:tcPr>
-          <w:p>
-            <w:pPr>
-              <w:spacing w:before="20" w:after="20"/>
-            </w:pPr>
-            <w:r>
-              <w:t xml:space="preserve">Lenguaje y marco</w:t>
-            </w:r>
-          </w:p>
-        </w:tc>
-        <w:tc>
-          <w:tcPr>
-            <w:tcW w:w="0" w:type="auto"/>
-          </w:tcPr>
-          <w:p>
-            <w:pPr>
-              <w:spacing w:before="20" w:after="20"/>
-            </w:pPr>
-            <w:r>
-              <w:t xml:space="preserve">Python 3.11 · Flask</w:t>
-            </w:r>
-          </w:p>
-        </w:tc>
-        <w:tc>
-          <w:tcPr>
-            <w:tcW w:w="0" w:type="auto"/>
-          </w:tcPr>
-          <w:p>
-            <w:pPr>
-              <w:spacing w:before="20" w:after="20"/>
-            </w:pPr>
-            <w:r>
-              <w:t xml:space="preserve">Implementación de los cuatro microservicios</w:t>
-            </w:r>
-          </w:p>
-        </w:tc>
-        <w:tc>
-          <w:tcPr>
-            <w:tcW w:w="0" w:type="auto"/>
-          </w:tcPr>
-          <w:p>
-            <w:pPr>
-              <w:spacing w:before="20" w:after="20"/>
-            </w:pPr>
-            <w:r>
-              <w:t xml:space="preserve">Alta</w:t>
-            </w:r>
-          </w:p>
-        </w:tc>
-      </w:tr>
-      <w:tr>
-        <w:tc>
-          <w:tcPr>
-            <w:tcW w:w="0" w:type="auto"/>
-          </w:tcPr>
-          <w:p>
-            <w:pPr>
-              <w:spacing w:before="20" w:after="20"/>
-            </w:pPr>
-            <w:r>
-              <w:t xml:space="preserve">Servidor de aplicación</w:t>
-            </w:r>
-          </w:p>
-        </w:tc>
-        <w:tc>
-          <w:tcPr>
-            <w:tcW w:w="0" w:type="auto"/>
-          </w:tcPr>
-          <w:p>
-            <w:pPr>
-              <w:spacing w:before="20" w:after="20"/>
-            </w:pPr>
-            <w:r>
-              <w:t xml:space="preserve">Gunicorn con trabajadores concurrentes</w:t>
-            </w:r>
-          </w:p>
-        </w:tc>
-        <w:tc>
-          <w:tcPr>
-            <w:tcW w:w="0" w:type="auto"/>
-          </w:tcPr>
-          <w:p>
-            <w:pPr>
-              <w:spacing w:before="20" w:after="20"/>
-            </w:pPr>
-            <w:r>
-              <w:t xml:space="preserve">Servir los microservicios bajo carga</w:t>
-            </w:r>
-          </w:p>
-        </w:tc>
-        <w:tc>
-          <w:tcPr>
-            <w:tcW w:w="0" w:type="auto"/>
-          </w:tcPr>
-          <w:p>
-            <w:pPr>
-              <w:spacing w:before="20" w:after="20"/>
-            </w:pPr>
-            <w:r>
-              <w:t xml:space="preserve">Media</w:t>
-            </w:r>
-          </w:p>
-        </w:tc>
-      </w:tr>
-      <w:tr>
-        <w:tc>
-          <w:tcPr>
-            <w:tcW w:w="0" w:type="auto"/>
-          </w:tcPr>
-          <w:p>
-            <w:pPr>
-              <w:spacing w:before="20" w:after="20"/>
-            </w:pPr>
-            <w:r>
-              <w:t xml:space="preserve">Base de datos</w:t>
-            </w:r>
-          </w:p>
-        </w:tc>
-        <w:tc>
-          <w:tcPr>
-            <w:tcW w:w="0" w:type="auto"/>
-          </w:tcPr>
-          <w:p>
-            <w:pPr>
-              <w:spacing w:before="20" w:after="20"/>
-            </w:pPr>
-            <w:r>
-              <w:t xml:space="preserve">PostgreSQL 15</w:t>
-            </w:r>
-          </w:p>
-        </w:tc>
-        <w:tc>
-          <w:tcPr>
-            <w:tcW w:w="0" w:type="auto"/>
-          </w:tcPr>
-          <w:p>
-            <w:pPr>
-              <w:spacing w:before="20" w:after="20"/>
-            </w:pPr>
-            <w:r>
-              <w:t xml:space="preserve">Persistencia transaccional; fuente de respaldo en EXP-03</w:t>
-            </w:r>
-          </w:p>
-        </w:tc>
-        <w:tc>
-          <w:tcPr>
-            <w:tcW w:w="0" w:type="auto"/>
-          </w:tcPr>
-          <w:p>
-            <w:pPr>
-              <w:spacing w:before="20" w:after="20"/>
-            </w:pPr>
-            <w:r>
-              <w:t xml:space="preserve">Alta</w:t>
-            </w:r>
-          </w:p>
-        </w:tc>
-      </w:tr>
-      <w:tr>
-        <w:tc>
-          <w:tcPr>
-            <w:tcW w:w="0" w:type="auto"/>
-          </w:tcPr>
-          <w:p>
-            <w:pPr>
-              <w:spacing w:before="20" w:after="20"/>
-            </w:pPr>
-            <w:r>
-              <w:t xml:space="preserve">Caché</w:t>
-            </w:r>
-          </w:p>
-        </w:tc>
-        <w:tc>
-          <w:tcPr>
-            <w:tcW w:w="0" w:type="auto"/>
-          </w:tcPr>
-          <w:p>
-            <w:pPr>
-              <w:spacing w:before="20" w:after="20"/>
-            </w:pPr>
-            <w:r>
-              <w:t xml:space="preserve">Redis 7</w:t>
-            </w:r>
-          </w:p>
-        </w:tc>
-        <w:tc>
-          <w:tcPr>
-            <w:tcW w:w="0" w:type="auto"/>
-          </w:tcPr>
-          <w:p>
-            <w:pPr>
-              <w:spacing w:before="20" w:after="20"/>
-            </w:pPr>
-            <w:r>
-              <w:t xml:space="preserve">Perfiles de riesgo; objeto de la falla inducida en EXP-03</w:t>
-            </w:r>
-          </w:p>
-        </w:tc>
-        <w:tc>
-          <w:tcPr>
-            <w:tcW w:w="0" w:type="auto"/>
-          </w:tcPr>
-          <w:p>
-            <w:pPr>
-              <w:spacing w:before="20" w:after="20"/>
-            </w:pPr>
-            <w:r>
-              <w:t xml:space="preserve">Media</w:t>
-            </w:r>
-          </w:p>
-        </w:tc>
-      </w:tr>
-      <w:tr>
-        <w:tc>
-          <w:tcPr>
-            <w:tcW w:w="0" w:type="auto"/>
-          </w:tcPr>
-          <w:p>
-            <w:pPr>
-              <w:spacing w:before="20" w:after="20"/>
-            </w:pPr>
-            <w:r>
-              <w:t xml:space="preserve">Bus de eventos</w:t>
-            </w:r>
-          </w:p>
-        </w:tc>
-        <w:tc>
-          <w:tcPr>
-            <w:tcW w:w="0" w:type="auto"/>
-          </w:tcPr>
-          <w:p>
-            <w:pPr>
-              <w:spacing w:before="20" w:after="20"/>
-            </w:pPr>
-            <w:r>
-              <w:t xml:space="preserve">Kafka 3.x en modo sin coordinador externo</w:t>
-            </w:r>
-          </w:p>
-        </w:tc>
-        <w:tc>
-          <w:tcPr>
-            <w:tcW w:w="0" w:type="auto"/>
-          </w:tcPr>
-          <w:p>
-            <w:pPr>
-              <w:spacing w:before="20" w:after="20"/>
-            </w:pPr>
-            <w:r>
-              <w:t xml:space="preserve">Inspección de mensajes en EXP-04</w:t>
-            </w:r>
-          </w:p>
-        </w:tc>
-        <w:tc>
-          <w:tcPr>
-            <w:tcW w:w="0" w:type="auto"/>
-          </w:tcPr>
-          <w:p>
-            <w:pPr>
-              <w:spacing w:before="20" w:after="20"/>
-            </w:pPr>
-            <w:r>
-              <w:t xml:space="preserve">Baja — se reserva tiempo de aprendizaje</w:t>
-            </w:r>
-          </w:p>
-        </w:tc>
-      </w:tr>
-      <w:tr>
-        <w:tc>
-          <w:tcPr>
-            <w:tcW w:w="0" w:type="auto"/>
-          </w:tcPr>
-          <w:p>
-            <w:pPr>
-              <w:spacing w:before="20" w:after="20"/>
-            </w:pPr>
-            <w:r>
-              <w:t xml:space="preserve">Cliente de base de datos</w:t>
-            </w:r>
-          </w:p>
-        </w:tc>
-        <w:tc>
-          <w:tcPr>
-            <w:tcW w:w="0" w:type="auto"/>
-          </w:tcPr>
-          <w:p>
-            <w:pPr>
-              <w:spacing w:before="20" w:after="20"/>
-            </w:pPr>
-            <w:r>
-              <w:t xml:space="preserve">psycopg con depósito de conexiones</w:t>
-            </w:r>
-          </w:p>
-        </w:tc>
-        <w:tc>
-          <w:tcPr>
-            <w:tcW w:w="0" w:type="auto"/>
-          </w:tcPr>
-          <w:p>
-            <w:pPr>
-              <w:spacing w:before="20" w:after="20"/>
-            </w:pPr>
-            <w:r>
-              <w:t xml:space="preserve">Conectores hacia PostgreSQL; aislamiento por mamparo</w:t>
-            </w:r>
-          </w:p>
-        </w:tc>
-        <w:tc>
-          <w:tcPr>
-            <w:tcW w:w="0" w:type="auto"/>
-          </w:tcPr>
-          <w:p>
-            <w:pPr>
-              <w:spacing w:before="20" w:after="20"/>
-            </w:pPr>
-            <w:r>
-              <w:t xml:space="preserve">Alta</w:t>
-            </w:r>
-          </w:p>
-        </w:tc>
-      </w:tr>
-      <w:tr>
-        <w:tc>
-          <w:tcPr>
-            <w:tcW w:w="0" w:type="auto"/>
-          </w:tcPr>
-          <w:p>
-            <w:pPr>
-              <w:spacing w:before="20" w:after="20"/>
-            </w:pPr>
-            <w:r>
-              <w:t xml:space="preserve">Cliente de caché</w:t>
-            </w:r>
-          </w:p>
-        </w:tc>
-        <w:tc>
-          <w:tcPr>
-            <w:tcW w:w="0" w:type="auto"/>
-          </w:tcPr>
-          <w:p>
-            <w:pPr>
-              <w:spacing w:before="20" w:after="20"/>
-            </w:pPr>
-            <w:r>
-              <w:t xml:space="preserve">redis-py con depósito</w:t>
-            </w:r>
-          </w:p>
-        </w:tc>
-        <w:tc>
-          <w:tcPr>
-            <w:tcW w:w="0" w:type="auto"/>
-          </w:tcPr>
-          <w:p>
-            <w:pPr>
-              <w:spacing w:before="20" w:after="20"/>
-            </w:pPr>
-            <w:r>
-              <w:t xml:space="preserve">Conector hacia Redis</w:t>
-            </w:r>
-          </w:p>
-        </w:tc>
-        <w:tc>
-          <w:tcPr>
-            <w:tcW w:w="0" w:type="auto"/>
-          </w:tcPr>
-          <w:p>
-            <w:pPr>
-              <w:spacing w:before="20" w:after="20"/>
-            </w:pPr>
-            <w:r>
-              <w:t xml:space="preserve">Media</w:t>
-            </w:r>
-          </w:p>
-        </w:tc>
-      </w:tr>
-      <w:tr>
-        <w:tc>
-          <w:tcPr>
-            <w:tcW w:w="0" w:type="auto"/>
-          </w:tcPr>
-          <w:p>
-            <w:pPr>
-              <w:spacing w:before="20" w:after="20"/>
-            </w:pPr>
-            <w:r>
-              <w:t xml:space="preserve">Cliente HTTP</w:t>
-            </w:r>
-          </w:p>
-        </w:tc>
-        <w:tc>
-          <w:tcPr>
-            <w:tcW w:w="0" w:type="auto"/>
-          </w:tcPr>
-          <w:p>
-            <w:pPr>
-              <w:spacing w:before="20" w:after="20"/>
-            </w:pPr>
-            <w:r>
-              <w:t xml:space="preserve">httpx con depósito y tiempo de espera</w:t>
-            </w:r>
-          </w:p>
-        </w:tc>
-        <w:tc>
-          <w:tcPr>
-            <w:tcW w:w="0" w:type="auto"/>
-          </w:tcPr>
-          <w:p>
-            <w:pPr>
-              <w:spacing w:before="20" w:after="20"/>
-            </w:pPr>
-            <w:r>
-              <w:t xml:space="preserve">Adaptadores hacia proveedores externos</w:t>
-            </w:r>
-          </w:p>
-        </w:tc>
-        <w:tc>
-          <w:tcPr>
-            <w:tcW w:w="0" w:type="auto"/>
-          </w:tcPr>
-          <w:p>
-            <w:pPr>
-              <w:spacing w:before="20" w:after="20"/>
-            </w:pPr>
-            <w:r>
-              <w:t xml:space="preserve">Alta</w:t>
-            </w:r>
-          </w:p>
-        </w:tc>
-      </w:tr>
-      <w:tr>
-        <w:tc>
-          <w:tcPr>
-            <w:tcW w:w="0" w:type="auto"/>
-          </w:tcPr>
-          <w:p>
-            <w:pPr>
-              <w:spacing w:before="20" w:after="20"/>
-            </w:pPr>
-            <w:r>
-              <w:t xml:space="preserve">Interruptor de circuito</w:t>
-            </w:r>
-          </w:p>
-        </w:tc>
-        <w:tc>
-          <w:tcPr>
-            <w:tcW w:w="0" w:type="auto"/>
-          </w:tcPr>
-          <w:p>
-            <w:pPr>
-              <w:spacing w:before="20" w:after="20"/>
-            </w:pPr>
-            <w:r>
-              <w:t xml:space="preserve">pybreaker</w:t>
-            </w:r>
-          </w:p>
-        </w:tc>
-        <w:tc>
-          <w:tcPr>
-            <w:tcW w:w="0" w:type="auto"/>
-          </w:tcPr>
-          <w:p>
-            <w:pPr>
-              <w:spacing w:before="20" w:after="20"/>
-            </w:pPr>
-            <w:r>
-              <w:t xml:space="preserve">Mecanismo bajo prueba en EXP-02</w:t>
-            </w:r>
-          </w:p>
-        </w:tc>
-        <w:tc>
-          <w:tcPr>
-            <w:tcW w:w="0" w:type="auto"/>
-          </w:tcPr>
-          <w:p>
-            <w:pPr>
-              <w:spacing w:before="20" w:after="20"/>
-            </w:pPr>
-            <w:r>
-              <w:t xml:space="preserve">Baja — se reserva tiempo de aprendizaje</w:t>
-            </w:r>
-          </w:p>
-        </w:tc>
-      </w:tr>
-      <w:tr>
-        <w:tc>
-          <w:tcPr>
-            <w:tcW w:w="0" w:type="auto"/>
-          </w:tcPr>
-          <w:p>
-            <w:pPr>
-              <w:spacing w:before="20" w:after="20"/>
-            </w:pPr>
-            <w:r>
-              <w:t xml:space="preserve">Orquestación local</w:t>
-            </w:r>
-          </w:p>
-        </w:tc>
-        <w:tc>
-          <w:tcPr>
-            <w:tcW w:w="0" w:type="auto"/>
-          </w:tcPr>
-          <w:p>
-            <w:pPr>
-              <w:spacing w:before="20" w:after="20"/>
-            </w:pPr>
-            <w:r>
-              <w:t xml:space="preserve">Docker · Docker Compose</w:t>
-            </w:r>
-          </w:p>
-        </w:tc>
-        <w:tc>
-          <w:tcPr>
-            <w:tcW w:w="0" w:type="auto"/>
-          </w:tcPr>
-          <w:p>
-            <w:pPr>
-              <w:spacing w:before="20" w:after="20"/>
-            </w:pPr>
-            <w:r>
-              <w:t xml:space="preserve">Entorno completo de los experimentos</w:t>
-            </w:r>
-          </w:p>
-        </w:tc>
-        <w:tc>
-          <w:tcPr>
-            <w:tcW w:w="0" w:type="auto"/>
-          </w:tcPr>
-          <w:p>
-            <w:pPr>
-              <w:spacing w:before="20" w:after="20"/>
-            </w:pPr>
-            <w:r>
-              <w:t xml:space="preserve">Alta</w:t>
-            </w:r>
-          </w:p>
-        </w:tc>
-      </w:tr>
-      <w:tr>
-        <w:tc>
-          <w:tcPr>
-            <w:tcW w:w="0" w:type="auto"/>
-          </w:tcPr>
-          <w:p>
-            <w:pPr>
-              <w:spacing w:before="20" w:after="20"/>
-            </w:pPr>
-            <w:r>
-              <w:t xml:space="preserve">Generación de carga</w:t>
-            </w:r>
-          </w:p>
-        </w:tc>
-        <w:tc>
-          <w:tcPr>
-            <w:tcW w:w="0" w:type="auto"/>
-          </w:tcPr>
-          <w:p>
-            <w:pPr>
-              <w:spacing w:before="20" w:after="20"/>
-            </w:pPr>
-            <w:r>
-              <w:t xml:space="preserve">Apache JMeter</w:t>
-            </w:r>
-          </w:p>
-        </w:tc>
-        <w:tc>
-          <w:tcPr>
-            <w:tcW w:w="0" w:type="auto"/>
-          </w:tcPr>
-          <w:p>
-            <w:pPr>
-              <w:spacing w:before="20" w:after="20"/>
-            </w:pPr>
-            <w:r>
-              <w:t xml:space="preserve">Carga y medición de percentiles en EXP-01, 02 y 03</w:t>
-            </w:r>
-          </w:p>
-        </w:tc>
-        <w:tc>
-          <w:tcPr>
-            <w:tcW w:w="0" w:type="auto"/>
-          </w:tcPr>
-          <w:p>
-            <w:pPr>
-              <w:spacing w:before="20" w:after="20"/>
-            </w:pPr>
-            <w:r>
-              <w:t xml:space="preserve">Media</w:t>
-            </w:r>
-          </w:p>
-        </w:tc>
-      </w:tr>
-      <w:tr>
-        <w:tc>
-          <w:tcPr>
-            <w:tcW w:w="0" w:type="auto"/>
-          </w:tcPr>
-          <w:p>
-            <w:pPr>
-              <w:spacing w:before="20" w:after="20"/>
-            </w:pPr>
-            <w:r>
-              <w:t xml:space="preserve">Simulación de dependencias</w:t>
-            </w:r>
-          </w:p>
-        </w:tc>
-        <w:tc>
-          <w:tcPr>
-            <w:tcW w:w="0" w:type="auto"/>
-          </w:tcPr>
-          <w:p>
-            <w:pPr>
-              <w:spacing w:before="20" w:after="20"/>
-            </w:pPr>
-            <w:r>
-              <w:t xml:space="preserve">Simulador HTTP con latencia controlada</w:t>
-            </w:r>
-          </w:p>
-        </w:tc>
-        <w:tc>
-          <w:tcPr>
-            <w:tcW w:w="0" w:type="auto"/>
-          </w:tcPr>
-          <w:p>
-            <w:pPr>
-              <w:spacing w:before="20" w:after="20"/>
-            </w:pPr>
-            <w:r>
-              <w:t xml:space="preserve">Open Finance degradado en EXP-01 y 02</w:t>
-            </w:r>
-          </w:p>
-        </w:tc>
-        <w:tc>
-          <w:tcPr>
-            <w:tcW w:w="0" w:type="auto"/>
-          </w:tcPr>
-          <w:p>
-            <w:pPr>
-              <w:spacing w:before="20" w:after="20"/>
-            </w:pPr>
-            <w:r>
-              <w:t xml:space="preserve">Media</w:t>
-            </w:r>
-          </w:p>
-        </w:tc>
-      </w:tr>
-      <w:tr>
-        <w:tc>
-          <w:tcPr>
-            <w:tcW w:w="0" w:type="auto"/>
-          </w:tcPr>
-          <w:p>
-            <w:pPr>
-              <w:spacing w:before="20" w:after="20"/>
-            </w:pPr>
-            <w:r>
-              <w:t xml:space="preserve">Trazas distribuidas</w:t>
-            </w:r>
-          </w:p>
-        </w:tc>
-        <w:tc>
-          <w:tcPr>
-            <w:tcW w:w="0" w:type="auto"/>
-          </w:tcPr>
-          <w:p>
-            <w:pPr>
-              <w:spacing w:before="20" w:after="20"/>
-            </w:pPr>
-            <w:r>
-              <w:t xml:space="preserve">Instrumentación de trazas por salto</w:t>
-            </w:r>
-          </w:p>
-        </w:tc>
-        <w:tc>
-          <w:tcPr>
-            <w:tcW w:w="0" w:type="auto"/>
-          </w:tcPr>
-          <w:p>
-            <w:pPr>
-              <w:spacing w:before="20" w:after="20"/>
-            </w:pPr>
-            <w:r>
-              <w:t xml:space="preserve">Atribución de latencia por componente</w:t>
-            </w:r>
-          </w:p>
-        </w:tc>
-        <w:tc>
-          <w:tcPr>
-            <w:tcW w:w="0" w:type="auto"/>
-          </w:tcPr>
-          <w:p>
-            <w:pPr>
-              <w:spacing w:before="20" w:after="20"/>
-            </w:pPr>
-            <w:r>
-              <w:t xml:space="preserve">Baja — se reserva tiempo de aprendizaje</w:t>
-            </w:r>
-          </w:p>
-        </w:tc>
-      </w:tr>
-      <w:tr>
-        <w:tc>
-          <w:tcPr>
-            <w:tcW w:w="0" w:type="auto"/>
-          </w:tcPr>
-          <w:p>
-            <w:pPr>
-              <w:spacing w:before="20" w:after="20"/>
-            </w:pPr>
-            <w:r>
-              <w:t xml:space="preserve">Seguridad</w:t>
-            </w:r>
-          </w:p>
-        </w:tc>
-        <w:tc>
-          <w:tcPr>
-            <w:tcW w:w="0" w:type="auto"/>
-          </w:tcPr>
-          <w:p>
-            <w:pPr>
-              <w:spacing w:before="20" w:after="20"/>
-            </w:pPr>
-            <w:r>
-              <w:t xml:space="preserve">OWASP ZAP</w:t>
-            </w:r>
-          </w:p>
-        </w:tc>
-        <w:tc>
-          <w:tcPr>
-            <w:tcW w:w="0" w:type="auto"/>
-          </w:tcPr>
-          <w:p>
-            <w:pPr>
-              <w:spacing w:before="20" w:after="20"/>
-            </w:pPr>
-            <w:r>
-              <w:t xml:space="preserve">Verificación de TLS en EXP-04</w:t>
-            </w:r>
-          </w:p>
-        </w:tc>
-        <w:tc>
-          <w:tcPr>
-            <w:tcW w:w="0" w:type="auto"/>
-          </w:tcPr>
-          <w:p>
-            <w:pPr>
-              <w:spacing w:before="20" w:after="20"/>
-            </w:pPr>
-            <w:r>
-              <w:t xml:space="preserve">Media</w:t>
-            </w:r>
-          </w:p>
-        </w:tc>
-      </w:tr>
-      <w:tr>
-        <w:tc>
-          <w:tcPr>
-            <w:tcW w:w="0" w:type="auto"/>
-          </w:tcPr>
-          <w:p>
-            <w:pPr>
-              <w:spacing w:before="20" w:after="20"/>
-            </w:pPr>
-            <w:r>
-              <w:t xml:space="preserve">Inspección de datos</w:t>
-            </w:r>
-          </w:p>
-        </w:tc>
-        <w:tc>
-          <w:tcPr>
-            <w:tcW w:w="0" w:type="auto"/>
-          </w:tcPr>
-          <w:p>
-            <w:pPr>
-              <w:spacing w:before="20" w:after="20"/>
-            </w:pPr>
-            <w:r>
-              <w:t xml:space="preserve">Consultas de verificación · consumidor de inspección de temas</w:t>
-            </w:r>
-          </w:p>
-        </w:tc>
-        <w:tc>
-          <w:tcPr>
-            <w:tcW w:w="0" w:type="auto"/>
-          </w:tcPr>
-          <w:p>
-            <w:pPr>
-              <w:spacing w:before="20" w:after="20"/>
-            </w:pPr>
-            <w:r>
-              <w:t xml:space="preserve">Búsqueda de datos cebo en EXP-04</w:t>
-            </w:r>
-          </w:p>
-        </w:tc>
-        <w:tc>
-          <w:tcPr>
-            <w:tcW w:w="0" w:type="auto"/>
-          </w:tcPr>
-          <w:p>
-            <w:pPr>
-              <w:spacing w:before="20" w:after="20"/>
-            </w:pPr>
-            <w:r>
-              <w:t xml:space="preserve">Alta</w:t>
-            </w:r>
-          </w:p>
-        </w:tc>
-      </w:tr>
-      <w:tr>
-        <w:tc>
-          <w:tcPr>
-            <w:tcW w:w="0" w:type="auto"/>
-          </w:tcPr>
-          <w:p>
-            <w:pPr>
-              <w:spacing w:before="20" w:after="20"/>
-            </w:pPr>
-            <w:r>
-              <w:t xml:space="preserve">Cifrado y llaves</w:t>
-            </w:r>
-          </w:p>
-        </w:tc>
-        <w:tc>
-          <w:tcPr>
-            <w:tcW w:w="0" w:type="auto"/>
-          </w:tcPr>
-          <w:p>
-            <w:pPr>
-              <w:spacing w:before="20" w:after="20"/>
-            </w:pPr>
-            <w:r>
-              <w:t xml:space="preserve">Servicio de gestión de llaves</w:t>
-            </w:r>
-          </w:p>
-        </w:tc>
-        <w:tc>
-          <w:tcPr>
-            <w:tcW w:w="0" w:type="auto"/>
-          </w:tcPr>
-          <w:p>
-            <w:pPr>
-              <w:spacing w:before="20" w:after="20"/>
-            </w:pPr>
-            <w:r>
-              <w:t xml:space="preserve">Cifrado del dato custodiado en EXP-04</w:t>
-            </w:r>
-          </w:p>
-        </w:tc>
-        <w:tc>
-          <w:tcPr>
-            <w:tcW w:w="0" w:type="auto"/>
-          </w:tcPr>
-          <w:p>
-            <w:pPr>
-              <w:spacing w:before="20" w:after="20"/>
-            </w:pPr>
-            <w:r>
-              <w:t xml:space="preserve">Baja — se reserva tiempo de aprendizaje</w:t>
+              <w:t xml:space="preserve">Horas</w:t>
+            </w:r>
+          </w:p>
+        </w:tc>
+      </w:tr>
+      <w:tr>
+        <w:tc>
+          <w:tcPr>
+            <w:tcW w:w="0" w:type="auto"/>
+          </w:tcPr>
+          <w:p>
+            <w:pPr>
+              <w:spacing w:before="20" w:after="20"/>
+            </w:pPr>
+            <w:r>
+              <w:rPr>
+                <w:b/>
+              </w:rPr>
+              <w:t xml:space="preserve">Miguel Gómez</w:t>
+            </w:r>
+          </w:p>
+        </w:tc>
+        <w:tc>
+          <w:tcPr>
+            <w:tcW w:w="0" w:type="auto"/>
+          </w:tcPr>
+          <w:p>
+            <w:pPr>
+              <w:spacing w:before="20" w:after="20"/>
+            </w:pPr>
+            <w:r>
+              <w:t xml:space="preserve">Construir el servicio de Perfilamiento con su caché; instrumentar las trazas por salto; calibrar el interruptor de circuito recorriendo la rejilla de configuraciones; ejecutar la verificación de TLS y la búsqueda de datos cebo</w:t>
+            </w:r>
+          </w:p>
+        </w:tc>
+        <w:tc>
+          <w:tcPr>
+            <w:tcW w:w="0" w:type="auto"/>
+          </w:tcPr>
+          <w:p>
+            <w:pPr>
+              <w:spacing w:before="20" w:after="20"/>
+            </w:pPr>
+            <w:r>
+              <w:t xml:space="preserve">EXP-01 · EXP-02 · EXP-04</w:t>
+            </w:r>
+          </w:p>
+        </w:tc>
+        <w:tc>
+          <w:tcPr>
+            <w:tcW w:w="0" w:type="auto"/>
+          </w:tcPr>
+          <w:p>
+            <w:pPr>
+              <w:spacing w:before="20" w:after="20"/>
+            </w:pPr>
+            <w:r>
+              <w:t xml:space="preserve">11 h</w:t>
+            </w:r>
+          </w:p>
+        </w:tc>
+      </w:tr>
+      <w:tr>
+        <w:tc>
+          <w:tcPr>
+            <w:tcW w:w="0" w:type="auto"/>
+          </w:tcPr>
+          <w:p>
+            <w:pPr>
+              <w:spacing w:before="20" w:after="20"/>
+            </w:pPr>
+            <w:r>
+              <w:rPr>
+                <w:b/>
+              </w:rPr>
+              <w:t xml:space="preserve">Angie Arandio</w:t>
+            </w:r>
+          </w:p>
+        </w:tc>
+        <w:tc>
+          <w:tcPr>
+            <w:tcW w:w="0" w:type="auto"/>
+          </w:tcPr>
+          <w:p>
+            <w:pPr>
+              <w:spacing w:before="20" w:after="20"/>
+            </w:pPr>
+            <w:r>
+              <w:t xml:space="preserve">Construir el servicio de Cotización y el motor de rating; construir la ruta de respaldo hacia PostgreSQL y los depósitos separados por dependencia; ejecutar la falla inducida del caché y conciliar transacciones</w:t>
+            </w:r>
+          </w:p>
+        </w:tc>
+        <w:tc>
+          <w:tcPr>
+            <w:tcW w:w="0" w:type="auto"/>
+          </w:tcPr>
+          <w:p>
+            <w:pPr>
+              <w:spacing w:before="20" w:after="20"/>
+            </w:pPr>
+            <w:r>
+              <w:t xml:space="preserve">EXP-01 · EXP-03</w:t>
+            </w:r>
+          </w:p>
+        </w:tc>
+        <w:tc>
+          <w:tcPr>
+            <w:tcW w:w="0" w:type="auto"/>
+          </w:tcPr>
+          <w:p>
+            <w:pPr>
+              <w:spacing w:before="20" w:after="20"/>
+            </w:pPr>
+            <w:r>
+              <w:t xml:space="preserve">11 h</w:t>
+            </w:r>
+          </w:p>
+        </w:tc>
+      </w:tr>
+      <w:tr>
+        <w:tc>
+          <w:tcPr>
+            <w:tcW w:w="0" w:type="auto"/>
+          </w:tcPr>
+          <w:p>
+            <w:pPr>
+              <w:spacing w:before="20" w:after="20"/>
+            </w:pPr>
+            <w:r>
+              <w:rPr>
+                <w:b/>
+              </w:rPr>
+              <w:t xml:space="preserve">Juan Mejía</w:t>
+            </w:r>
+          </w:p>
+        </w:tc>
+        <w:tc>
+          <w:tcPr>
+            <w:tcW w:w="0" w:type="auto"/>
+          </w:tcPr>
+          <w:p>
+            <w:pPr>
+              <w:spacing w:before="20" w:after="20"/>
+            </w:pPr>
+            <w:r>
+              <w:t xml:space="preserve">Construir el adaptador Open Finance y el simulador con latencia controlada; construir el servicio de Tokenización e integrarlo al recorrido; configurar los conectores con sus depósitos y tiempos de espera</w:t>
+            </w:r>
+          </w:p>
+        </w:tc>
+        <w:tc>
+          <w:tcPr>
+            <w:tcW w:w="0" w:type="auto"/>
+          </w:tcPr>
+          <w:p>
+            <w:pPr>
+              <w:spacing w:before="20" w:after="20"/>
+            </w:pPr>
+            <w:r>
+              <w:t xml:space="preserve">EXP-01 · EXP-02 · EXP-04</w:t>
+            </w:r>
+          </w:p>
+        </w:tc>
+        <w:tc>
+          <w:tcPr>
+            <w:tcW w:w="0" w:type="auto"/>
+          </w:tcPr>
+          <w:p>
+            <w:pPr>
+              <w:spacing w:before="20" w:after="20"/>
+            </w:pPr>
+            <w:r>
+              <w:t xml:space="preserve">10 h</w:t>
+            </w:r>
+          </w:p>
+        </w:tc>
+      </w:tr>
+      <w:tr>
+        <w:tc>
+          <w:tcPr>
+            <w:tcW w:w="0" w:type="auto"/>
+          </w:tcPr>
+          <w:p>
+            <w:pPr>
+              <w:spacing w:before="20" w:after="20"/>
+            </w:pPr>
+            <w:r>
+              <w:rPr>
+                <w:b/>
+              </w:rPr>
+              <w:t xml:space="preserve">Jazmin Córdoba</w:t>
+            </w:r>
+          </w:p>
+        </w:tc>
+        <w:tc>
+          <w:tcPr>
+            <w:tcW w:w="0" w:type="auto"/>
+          </w:tcPr>
+          <w:p>
+            <w:pPr>
+              <w:spacing w:before="20" w:after="20"/>
+            </w:pPr>
+            <w:r>
+              <w:t xml:space="preserve">Preparar el entorno en contenedores; construir los planes de carga en JMeter; ejecutar las corridas y consolidar las mediciones; redactar el informe de resultados y la decisión que se toma con cada uno</w:t>
+            </w:r>
+          </w:p>
+        </w:tc>
+        <w:tc>
+          <w:tcPr>
+            <w:tcW w:w="0" w:type="auto"/>
+          </w:tcPr>
+          <w:p>
+            <w:pPr>
+              <w:spacing w:before="20" w:after="20"/>
+            </w:pPr>
+            <w:r>
+              <w:t xml:space="preserve">EXP-01 · EXP-02 · EXP-03</w:t>
+            </w:r>
+          </w:p>
+        </w:tc>
+        <w:tc>
+          <w:tcPr>
+            <w:tcW w:w="0" w:type="auto"/>
+          </w:tcPr>
+          <w:p>
+            <w:pPr>
+              <w:spacing w:before="20" w:after="20"/>
+            </w:pPr>
+            <w:r>
+              <w:t xml:space="preserve">10 h</w:t>
+            </w:r>
+          </w:p>
+        </w:tc>
+      </w:tr>
+      <w:tr>
+        <w:tc>
+          <w:tcPr>
+            <w:tcW w:w="0" w:type="auto"/>
+          </w:tcPr>
+          <w:p>
+            <w:pPr>
+              <w:spacing w:before="20" w:after="20"/>
+            </w:pPr>
+            <w:r>
+              <w:t/>
+            </w:r>
+          </w:p>
+        </w:tc>
+        <w:tc>
+          <w:tcPr>
+            <w:tcW w:w="0" w:type="auto"/>
+          </w:tcPr>
+          <w:p>
+            <w:pPr>
+              <w:spacing w:before="20" w:after="20"/>
+            </w:pPr>
+            <w:r>
+              <w:t/>
+            </w:r>
+          </w:p>
+        </w:tc>
+        <w:tc>
+          <w:tcPr>
+            <w:tcW w:w="0" w:type="auto"/>
+          </w:tcPr>
+          <w:p>
+            <w:pPr>
+              <w:spacing w:before="20" w:after="20"/>
+            </w:pPr>
+            <w:r>
+              <w:rPr>
+                <w:b/>
+              </w:rPr>
+              <w:t xml:space="preserve">Total</w:t>
+            </w:r>
+          </w:p>
+        </w:tc>
+        <w:tc>
+          <w:tcPr>
+            <w:tcW w:w="0" w:type="auto"/>
+          </w:tcPr>
+          <w:p>
+            <w:pPr>
+              <w:spacing w:before="20" w:after="20"/>
+            </w:pPr>
+            <w:r>
+              <w:rPr>
+                <w:b/>
+              </w:rPr>
+              <w:t xml:space="preserve">42 h</w:t>
             </w:r>
           </w:p>
         </w:tc>
@@ -11077,6 +10857,14 @@
     <w:p>
       <w:r>
         <w:t/>
+      </w:r>
+    </w:p>
+    <w:p>
+      <w:pPr>
+        <w:pStyle w:val="Quote"/>
+      </w:pPr>
+      <w:r>
+        <w:t xml:space="preserve">El reparto asigna a cada integrante al menos dos experimentos y combina construcción con medición, de modo que nadie quede solo construyendo ni solo midiendo. La redacción del informe se asigna explícitamente porque un experimento cuyo resultado no se documenta no reduce la incertidumbre del equipo, solo la de quien lo ejecutó.</w:t>
       </w:r>
     </w:p>
     <w:p>
@@ -11084,12 +10872,7 @@
         <w:pStyle w:val="Heading3"/>
       </w:pPr>
       <w:r>
-        <w:t xml:space="preserve">5.9 Distribución de actividades por integrante</w:t>
-      </w:r>
-    </w:p>
-    <w:p>
-      <w:r>
-        <w:t xml:space="preserve">Las 42 horas del Sprint 1 de diseño se reparten de forma equitativa entre los cuatro integrantes, asignando a cada uno las actividades más cercanas a su rol pero sin dejar a nadie fuera de la construcción.</w:t>
+        <w:t xml:space="preserve">5.9 Resumen de esfuerzo del programa</w:t>
       </w:r>
     </w:p>
     <w:tbl>
@@ -11122,7 +10905,7 @@
               <w:rPr>
                 <w:b/>
               </w:rPr>
-              <w:t xml:space="preserve">Integrante</w:t>
+              <w:t xml:space="preserve">Experimento</w:t>
             </w:r>
           </w:p>
         </w:tc>
@@ -11139,7 +10922,7 @@
               <w:rPr>
                 <w:b/>
               </w:rPr>
-              <w:t xml:space="preserve">Actividades asignadas</w:t>
+              <w:t xml:space="preserve">Historia</w:t>
             </w:r>
           </w:p>
         </w:tc>
@@ -11156,7 +10939,7 @@
               <w:rPr>
                 <w:b/>
               </w:rPr>
-              <w:t xml:space="preserve">Experimentos</w:t>
+              <w:t xml:space="preserve">ASR</w:t>
             </w:r>
           </w:p>
         </w:tc>
@@ -11173,165 +10956,95 @@
               <w:rPr>
                 <w:b/>
               </w:rPr>
-              <w:t xml:space="preserve">Horas</w:t>
-            </w:r>
-          </w:p>
-        </w:tc>
-      </w:tr>
-      <w:tr>
-        <w:tc>
-          <w:tcPr>
-            <w:tcW w:w="0" w:type="auto"/>
-          </w:tcPr>
-          <w:p>
-            <w:pPr>
-              <w:spacing w:before="20" w:after="20"/>
-            </w:pPr>
-            <w:r>
-              <w:rPr>
-                <w:b/>
-              </w:rPr>
-              <w:t xml:space="preserve">Miguel Gómez</w:t>
-            </w:r>
-          </w:p>
-        </w:tc>
-        <w:tc>
-          <w:tcPr>
-            <w:tcW w:w="0" w:type="auto"/>
-          </w:tcPr>
-          <w:p>
-            <w:pPr>
-              <w:spacing w:before="20" w:after="20"/>
-            </w:pPr>
-            <w:r>
-              <w:t xml:space="preserve">Construir el servicio de Perfilamiento con su caché; instrumentar las trazas por salto; calibrar el interruptor de circuito recorriendo la rejilla de configuraciones; ejecutar la verificación de TLS y la búsqueda de datos cebo</w:t>
-            </w:r>
-          </w:p>
-        </w:tc>
-        <w:tc>
-          <w:tcPr>
-            <w:tcW w:w="0" w:type="auto"/>
-          </w:tcPr>
-          <w:p>
-            <w:pPr>
-              <w:spacing w:before="20" w:after="20"/>
-            </w:pPr>
-            <w:r>
-              <w:t xml:space="preserve">EXP-01 · EXP-02 · EXP-04</w:t>
-            </w:r>
-          </w:p>
-        </w:tc>
-        <w:tc>
-          <w:tcPr>
-            <w:tcW w:w="0" w:type="auto"/>
-          </w:tcPr>
-          <w:p>
-            <w:pPr>
-              <w:spacing w:before="20" w:after="20"/>
-            </w:pPr>
-            <w:r>
-              <w:t xml:space="preserve">11 h</w:t>
-            </w:r>
-          </w:p>
-        </w:tc>
-      </w:tr>
-      <w:tr>
-        <w:tc>
-          <w:tcPr>
-            <w:tcW w:w="0" w:type="auto"/>
-          </w:tcPr>
-          <w:p>
-            <w:pPr>
-              <w:spacing w:before="20" w:after="20"/>
-            </w:pPr>
-            <w:r>
-              <w:rPr>
-                <w:b/>
-              </w:rPr>
-              <w:t xml:space="preserve">Angie Arandio</w:t>
-            </w:r>
-          </w:p>
-        </w:tc>
-        <w:tc>
-          <w:tcPr>
-            <w:tcW w:w="0" w:type="auto"/>
-          </w:tcPr>
-          <w:p>
-            <w:pPr>
-              <w:spacing w:before="20" w:after="20"/>
-            </w:pPr>
-            <w:r>
-              <w:t xml:space="preserve">Construir el servicio de Cotización y el motor de rating; construir la ruta de respaldo hacia PostgreSQL y los depósitos separados por dependencia; ejecutar la falla inducida del caché y conciliar transacciones</w:t>
-            </w:r>
-          </w:p>
-        </w:tc>
-        <w:tc>
-          <w:tcPr>
-            <w:tcW w:w="0" w:type="auto"/>
-          </w:tcPr>
-          <w:p>
-            <w:pPr>
-              <w:spacing w:before="20" w:after="20"/>
-            </w:pPr>
-            <w:r>
-              <w:t xml:space="preserve">EXP-01 · EXP-03</w:t>
-            </w:r>
-          </w:p>
-        </w:tc>
-        <w:tc>
-          <w:tcPr>
-            <w:tcW w:w="0" w:type="auto"/>
-          </w:tcPr>
-          <w:p>
-            <w:pPr>
-              <w:spacing w:before="20" w:after="20"/>
-            </w:pPr>
-            <w:r>
-              <w:t xml:space="preserve">11 h</w:t>
-            </w:r>
-          </w:p>
-        </w:tc>
-      </w:tr>
-      <w:tr>
-        <w:tc>
-          <w:tcPr>
-            <w:tcW w:w="0" w:type="auto"/>
-          </w:tcPr>
-          <w:p>
-            <w:pPr>
-              <w:spacing w:before="20" w:after="20"/>
-            </w:pPr>
-            <w:r>
-              <w:rPr>
-                <w:b/>
-              </w:rPr>
-              <w:t xml:space="preserve">Juan Mejía</w:t>
-            </w:r>
-          </w:p>
-        </w:tc>
-        <w:tc>
-          <w:tcPr>
-            <w:tcW w:w="0" w:type="auto"/>
-          </w:tcPr>
-          <w:p>
-            <w:pPr>
-              <w:spacing w:before="20" w:after="20"/>
-            </w:pPr>
-            <w:r>
-              <w:t xml:space="preserve">Construir el adaptador Open Finance y el simulador con latencia controlada; construir el servicio de Tokenización e integrarlo al recorrido; configurar los conectores con sus depósitos y tiempos de espera</w:t>
-            </w:r>
-          </w:p>
-        </w:tc>
-        <w:tc>
-          <w:tcPr>
-            <w:tcW w:w="0" w:type="auto"/>
-          </w:tcPr>
-          <w:p>
-            <w:pPr>
-              <w:spacing w:before="20" w:after="20"/>
-            </w:pPr>
-            <w:r>
-              <w:t xml:space="preserve">EXP-01 · EXP-02 · EXP-04</w:t>
+              <w:t xml:space="preserve">Incertidumbre</w:t>
+            </w:r>
+          </w:p>
+        </w:tc>
+        <w:tc>
+          <w:tcPr>
+            <w:tcW w:w="0" w:type="auto"/>
+            <w:shd w:val="clear" w:fill="EDF2F7"/>
+          </w:tcPr>
+          <w:p>
+            <w:pPr>
+              <w:spacing w:before="20" w:after="20"/>
+            </w:pPr>
+            <w:r>
+              <w:rPr>
+                <w:b/>
+              </w:rPr>
+              <w:t xml:space="preserve">Esfuerzo</w:t>
+            </w:r>
+          </w:p>
+        </w:tc>
+        <w:tc>
+          <w:tcPr>
+            <w:tcW w:w="0" w:type="auto"/>
+            <w:shd w:val="clear" w:fill="EDF2F7"/>
+          </w:tcPr>
+          <w:p>
+            <w:pPr>
+              <w:spacing w:before="20" w:after="20"/>
+            </w:pPr>
+            <w:r>
+              <w:rPr>
+                <w:b/>
+              </w:rPr>
+              <w:t xml:space="preserve">Cuándo</w:t>
+            </w:r>
+          </w:p>
+        </w:tc>
+      </w:tr>
+      <w:tr>
+        <w:tc>
+          <w:tcPr>
+            <w:tcW w:w="0" w:type="auto"/>
+          </w:tcPr>
+          <w:p>
+            <w:pPr>
+              <w:spacing w:before="20" w:after="20"/>
+            </w:pPr>
+            <w:r>
+              <w:t xml:space="preserve">EXP-01 Presupuesto de latencia</w:t>
+            </w:r>
+          </w:p>
+        </w:tc>
+        <w:tc>
+          <w:tcPr>
+            <w:tcW w:w="0" w:type="auto"/>
+          </w:tcPr>
+          <w:p>
+            <w:pPr>
+              <w:spacing w:before="20" w:after="20"/>
+            </w:pPr>
+            <w:r>
+              <w:t xml:space="preserve">HU-ARQ-07</w:t>
+            </w:r>
+          </w:p>
+        </w:tc>
+        <w:tc>
+          <w:tcPr>
+            <w:tcW w:w="0" w:type="auto"/>
+          </w:tcPr>
+          <w:p>
+            <w:pPr>
+              <w:spacing w:before="20" w:after="20"/>
+            </w:pPr>
+            <w:r>
+              <w:t xml:space="preserve">ASR-1.1</w:t>
+            </w:r>
+          </w:p>
+        </w:tc>
+        <w:tc>
+          <w:tcPr>
+            <w:tcW w:w="0" w:type="auto"/>
+          </w:tcPr>
+          <w:p>
+            <w:pPr>
+              <w:spacing w:before="20" w:after="20"/>
+            </w:pPr>
+            <w:r>
+              <w:t xml:space="preserve">Alta</w:t>
             </w:r>
           </w:p>
         </w:tc>
@@ -11348,65 +11061,277 @@
             </w:r>
           </w:p>
         </w:tc>
-      </w:tr>
-      <w:tr>
-        <w:tc>
-          <w:tcPr>
-            <w:tcW w:w="0" w:type="auto"/>
-          </w:tcPr>
-          <w:p>
-            <w:pPr>
-              <w:spacing w:before="20" w:after="20"/>
-            </w:pPr>
-            <w:r>
-              <w:rPr>
-                <w:b/>
-              </w:rPr>
-              <w:t xml:space="preserve">Jazmin Córdoba</w:t>
-            </w:r>
-          </w:p>
-        </w:tc>
-        <w:tc>
-          <w:tcPr>
-            <w:tcW w:w="0" w:type="auto"/>
-          </w:tcPr>
-          <w:p>
-            <w:pPr>
-              <w:spacing w:before="20" w:after="20"/>
-            </w:pPr>
-            <w:r>
-              <w:t xml:space="preserve">Preparar el entorno en contenedores; construir los planes de carga en JMeter; ejecutar las corridas y consolidar las mediciones; redactar el informe de resultados y la decisión que se toma con cada uno</w:t>
-            </w:r>
-          </w:p>
-        </w:tc>
-        <w:tc>
-          <w:tcPr>
-            <w:tcW w:w="0" w:type="auto"/>
-          </w:tcPr>
-          <w:p>
-            <w:pPr>
-              <w:spacing w:before="20" w:after="20"/>
-            </w:pPr>
-            <w:r>
-              <w:t xml:space="preserve">EXP-01 · EXP-02 · EXP-03</w:t>
-            </w:r>
-          </w:p>
-        </w:tc>
-        <w:tc>
-          <w:tcPr>
-            <w:tcW w:w="0" w:type="auto"/>
-          </w:tcPr>
-          <w:p>
-            <w:pPr>
-              <w:spacing w:before="20" w:after="20"/>
-            </w:pPr>
-            <w:r>
-              <w:t xml:space="preserve">10 h</w:t>
-            </w:r>
-          </w:p>
-        </w:tc>
-      </w:tr>
-      <w:tr>
+        <w:tc>
+          <w:tcPr>
+            <w:tcW w:w="0" w:type="auto"/>
+          </w:tcPr>
+          <w:p>
+            <w:pPr>
+              <w:spacing w:before="20" w:after="20"/>
+            </w:pPr>
+            <w:r>
+              <w:t xml:space="preserve">Semana 5</w:t>
+            </w:r>
+          </w:p>
+        </w:tc>
+      </w:tr>
+      <w:tr>
+        <w:tc>
+          <w:tcPr>
+            <w:tcW w:w="0" w:type="auto"/>
+          </w:tcPr>
+          <w:p>
+            <w:pPr>
+              <w:spacing w:before="20" w:after="20"/>
+            </w:pPr>
+            <w:r>
+              <w:t xml:space="preserve">EXP-02 Degradación elegante</w:t>
+            </w:r>
+          </w:p>
+        </w:tc>
+        <w:tc>
+          <w:tcPr>
+            <w:tcW w:w="0" w:type="auto"/>
+          </w:tcPr>
+          <w:p>
+            <w:pPr>
+              <w:spacing w:before="20" w:after="20"/>
+            </w:pPr>
+            <w:r>
+              <w:t xml:space="preserve">HU-ARQ-08</w:t>
+            </w:r>
+          </w:p>
+        </w:tc>
+        <w:tc>
+          <w:tcPr>
+            <w:tcW w:w="0" w:type="auto"/>
+          </w:tcPr>
+          <w:p>
+            <w:pPr>
+              <w:spacing w:before="20" w:after="20"/>
+            </w:pPr>
+            <w:r>
+              <w:t xml:space="preserve">ASR-1.2</w:t>
+            </w:r>
+          </w:p>
+        </w:tc>
+        <w:tc>
+          <w:tcPr>
+            <w:tcW w:w="0" w:type="auto"/>
+          </w:tcPr>
+          <w:p>
+            <w:pPr>
+              <w:spacing w:before="20" w:after="20"/>
+            </w:pPr>
+            <w:r>
+              <w:t xml:space="preserve">Alta</w:t>
+            </w:r>
+          </w:p>
+        </w:tc>
+        <w:tc>
+          <w:tcPr>
+            <w:tcW w:w="0" w:type="auto"/>
+          </w:tcPr>
+          <w:p>
+            <w:pPr>
+              <w:spacing w:before="20" w:after="20"/>
+            </w:pPr>
+            <w:r>
+              <w:t xml:space="preserve">12 h</w:t>
+            </w:r>
+          </w:p>
+        </w:tc>
+        <w:tc>
+          <w:tcPr>
+            <w:tcW w:w="0" w:type="auto"/>
+          </w:tcPr>
+          <w:p>
+            <w:pPr>
+              <w:spacing w:before="20" w:after="20"/>
+            </w:pPr>
+            <w:r>
+              <w:t xml:space="preserve">Semana 5</w:t>
+            </w:r>
+          </w:p>
+        </w:tc>
+      </w:tr>
+      <w:tr>
+        <w:tc>
+          <w:tcPr>
+            <w:tcW w:w="0" w:type="auto"/>
+          </w:tcPr>
+          <w:p>
+            <w:pPr>
+              <w:spacing w:before="20" w:after="20"/>
+            </w:pPr>
+            <w:r>
+              <w:t xml:space="preserve">EXP-03 Caída del caché</w:t>
+            </w:r>
+          </w:p>
+        </w:tc>
+        <w:tc>
+          <w:tcPr>
+            <w:tcW w:w="0" w:type="auto"/>
+          </w:tcPr>
+          <w:p>
+            <w:pPr>
+              <w:spacing w:before="20" w:after="20"/>
+            </w:pPr>
+            <w:r>
+              <w:t xml:space="preserve">HU-ARQ-06</w:t>
+            </w:r>
+          </w:p>
+        </w:tc>
+        <w:tc>
+          <w:tcPr>
+            <w:tcW w:w="0" w:type="auto"/>
+          </w:tcPr>
+          <w:p>
+            <w:pPr>
+              <w:spacing w:before="20" w:after="20"/>
+            </w:pPr>
+            <w:r>
+              <w:t xml:space="preserve">ASR-3.1</w:t>
+            </w:r>
+          </w:p>
+        </w:tc>
+        <w:tc>
+          <w:tcPr>
+            <w:tcW w:w="0" w:type="auto"/>
+          </w:tcPr>
+          <w:p>
+            <w:pPr>
+              <w:spacing w:before="20" w:after="20"/>
+            </w:pPr>
+            <w:r>
+              <w:t xml:space="preserve">Alta</w:t>
+            </w:r>
+          </w:p>
+        </w:tc>
+        <w:tc>
+          <w:tcPr>
+            <w:tcW w:w="0" w:type="auto"/>
+          </w:tcPr>
+          <w:p>
+            <w:pPr>
+              <w:spacing w:before="20" w:after="20"/>
+            </w:pPr>
+            <w:r>
+              <w:t xml:space="preserve">8 h</w:t>
+            </w:r>
+          </w:p>
+        </w:tc>
+        <w:tc>
+          <w:tcPr>
+            <w:tcW w:w="0" w:type="auto"/>
+          </w:tcPr>
+          <w:p>
+            <w:pPr>
+              <w:spacing w:before="20" w:after="20"/>
+            </w:pPr>
+            <w:r>
+              <w:t xml:space="preserve">Semana 6</w:t>
+            </w:r>
+          </w:p>
+        </w:tc>
+      </w:tr>
+      <w:tr>
+        <w:tc>
+          <w:tcPr>
+            <w:tcW w:w="0" w:type="auto"/>
+          </w:tcPr>
+          <w:p>
+            <w:pPr>
+              <w:spacing w:before="20" w:after="20"/>
+            </w:pPr>
+            <w:r>
+              <w:t xml:space="preserve">EXP-04 Tokenización</w:t>
+            </w:r>
+          </w:p>
+        </w:tc>
+        <w:tc>
+          <w:tcPr>
+            <w:tcW w:w="0" w:type="auto"/>
+          </w:tcPr>
+          <w:p>
+            <w:pPr>
+              <w:spacing w:before="20" w:after="20"/>
+            </w:pPr>
+            <w:r>
+              <w:t xml:space="preserve">HU-ARQ-03</w:t>
+            </w:r>
+          </w:p>
+        </w:tc>
+        <w:tc>
+          <w:tcPr>
+            <w:tcW w:w="0" w:type="auto"/>
+          </w:tcPr>
+          <w:p>
+            <w:pPr>
+              <w:spacing w:before="20" w:after="20"/>
+            </w:pPr>
+            <w:r>
+              <w:t xml:space="preserve">ASR-4.1</w:t>
+            </w:r>
+          </w:p>
+        </w:tc>
+        <w:tc>
+          <w:tcPr>
+            <w:tcW w:w="0" w:type="auto"/>
+          </w:tcPr>
+          <w:p>
+            <w:pPr>
+              <w:spacing w:before="20" w:after="20"/>
+            </w:pPr>
+            <w:r>
+              <w:t xml:space="preserve">Alta</w:t>
+            </w:r>
+          </w:p>
+        </w:tc>
+        <w:tc>
+          <w:tcPr>
+            <w:tcW w:w="0" w:type="auto"/>
+          </w:tcPr>
+          <w:p>
+            <w:pPr>
+              <w:spacing w:before="20" w:after="20"/>
+            </w:pPr>
+            <w:r>
+              <w:t xml:space="preserve">12 h</w:t>
+            </w:r>
+          </w:p>
+        </w:tc>
+        <w:tc>
+          <w:tcPr>
+            <w:tcW w:w="0" w:type="auto"/>
+          </w:tcPr>
+          <w:p>
+            <w:pPr>
+              <w:spacing w:before="20" w:after="20"/>
+            </w:pPr>
+            <w:r>
+              <w:t xml:space="preserve">Semana 6</w:t>
+            </w:r>
+          </w:p>
+        </w:tc>
+      </w:tr>
+      <w:tr>
+        <w:tc>
+          <w:tcPr>
+            <w:tcW w:w="0" w:type="auto"/>
+          </w:tcPr>
+          <w:p>
+            <w:pPr>
+              <w:spacing w:before="20" w:after="20"/>
+            </w:pPr>
+            <w:r>
+              <w:rPr>
+                <w:b/>
+              </w:rPr>
+              <w:t xml:space="preserve">Total del Sprint 1 de diseño</w:t>
+            </w:r>
+          </w:p>
+        </w:tc>
         <w:tc>
           <w:tcPr>
             <w:tcW w:w="0" w:type="auto"/>
@@ -11442,10 +11367,7 @@
               <w:spacing w:before="20" w:after="20"/>
             </w:pPr>
             <w:r>
-              <w:rPr>
-                <w:b/>
-              </w:rPr>
-              <w:t xml:space="preserve">Total</w:t>
+              <w:t/>
             </w:r>
           </w:p>
         </w:tc>
@@ -11465,6 +11387,22 @@
             </w:r>
           </w:p>
         </w:tc>
+        <w:tc>
+          <w:tcPr>
+            <w:tcW w:w="0" w:type="auto"/>
+          </w:tcPr>
+          <w:p>
+            <w:pPr>
+              <w:spacing w:before="20" w:after="20"/>
+            </w:pPr>
+            <w:r>
+              <w:rPr>
+                <w:b/>
+              </w:rPr>
+              <w:t xml:space="preserve">Semanas 5–6</w:t>
+            </w:r>
+          </w:p>
+        </w:tc>
       </w:tr>
     </w:tbl>
     <w:p>
@@ -11473,810 +11411,13 @@
       </w:r>
     </w:p>
     <w:p>
-      <w:pPr>
-        <w:pStyle w:val="Quote"/>
-      </w:pPr>
-      <w:r>
-        <w:t xml:space="preserve">El reparto asigna a cada integrante al menos dos experimentos y combina construcción con medición, de modo que nadie quede solo construyendo ni solo midiendo. La redacción del informe se asigna explícitamente porque un experimento cuyo resultado no se documenta no reduce la incertidumbre del equipo, solo la de quien lo ejecutó.</w:t>
-      </w:r>
-    </w:p>
-    <w:p>
-      <w:pPr>
-        <w:pStyle w:val="Heading3"/>
-      </w:pPr>
-      <w:r>
-        <w:t xml:space="preserve">5.10 Resumen de esfuerzo del programa</w:t>
-      </w:r>
-    </w:p>
-    <w:tbl>
-      <w:tblPr>
-        <w:tblW w:w="5000" w:type="pct"/>
-        <w:tblBorders>
-          <w:top w:val="single" w:sz="4" w:space="0" w:color="BFBFBF"/>
-          <w:left w:val="single" w:sz="4" w:space="0" w:color="BFBFBF"/>
-          <w:bottom w:val="single" w:sz="4" w:space="0" w:color="BFBFBF"/>
-          <w:right w:val="single" w:sz="4" w:space="0" w:color="BFBFBF"/>
-          <w:insideH w:val="single" w:sz="4" w:space="0" w:color="BFBFBF"/>
-          <w:insideV w:val="single" w:sz="4" w:space="0" w:color="BFBFBF"/>
-        </w:tblBorders>
-        <w:tblLayout w:type="fixed"/>
-      </w:tblPr>
-      <w:tr>
-        <w:trPr>
-          <w:tblHeader/>
-        </w:trPr>
-        <w:tc>
-          <w:tcPr>
-            <w:tcW w:w="0" w:type="auto"/>
-            <w:shd w:val="clear" w:fill="EDF2F7"/>
-          </w:tcPr>
-          <w:p>
-            <w:pPr>
-              <w:spacing w:before="20" w:after="20"/>
-            </w:pPr>
-            <w:r>
-              <w:rPr>
-                <w:b/>
-              </w:rPr>
-              <w:t xml:space="preserve">Experimento</w:t>
-            </w:r>
-          </w:p>
-        </w:tc>
-        <w:tc>
-          <w:tcPr>
-            <w:tcW w:w="0" w:type="auto"/>
-            <w:shd w:val="clear" w:fill="EDF2F7"/>
-          </w:tcPr>
-          <w:p>
-            <w:pPr>
-              <w:spacing w:before="20" w:after="20"/>
-            </w:pPr>
-            <w:r>
-              <w:rPr>
-                <w:b/>
-              </w:rPr>
-              <w:t xml:space="preserve">Historia</w:t>
-            </w:r>
-          </w:p>
-        </w:tc>
-        <w:tc>
-          <w:tcPr>
-            <w:tcW w:w="0" w:type="auto"/>
-            <w:shd w:val="clear" w:fill="EDF2F7"/>
-          </w:tcPr>
-          <w:p>
-            <w:pPr>
-              <w:spacing w:before="20" w:after="20"/>
-            </w:pPr>
-            <w:r>
-              <w:rPr>
-                <w:b/>
-              </w:rPr>
-              <w:t xml:space="preserve">ASR</w:t>
-            </w:r>
-          </w:p>
-        </w:tc>
-        <w:tc>
-          <w:tcPr>
-            <w:tcW w:w="0" w:type="auto"/>
-            <w:shd w:val="clear" w:fill="EDF2F7"/>
-          </w:tcPr>
-          <w:p>
-            <w:pPr>
-              <w:spacing w:before="20" w:after="20"/>
-            </w:pPr>
-            <w:r>
-              <w:rPr>
-                <w:b/>
-              </w:rPr>
-              <w:t xml:space="preserve">Incertidumbre</w:t>
-            </w:r>
-          </w:p>
-        </w:tc>
-        <w:tc>
-          <w:tcPr>
-            <w:tcW w:w="0" w:type="auto"/>
-            <w:shd w:val="clear" w:fill="EDF2F7"/>
-          </w:tcPr>
-          <w:p>
-            <w:pPr>
-              <w:spacing w:before="20" w:after="20"/>
-            </w:pPr>
-            <w:r>
-              <w:rPr>
-                <w:b/>
-              </w:rPr>
-              <w:t xml:space="preserve">Esfuerzo</w:t>
-            </w:r>
-          </w:p>
-        </w:tc>
-        <w:tc>
-          <w:tcPr>
-            <w:tcW w:w="0" w:type="auto"/>
-            <w:shd w:val="clear" w:fill="EDF2F7"/>
-          </w:tcPr>
-          <w:p>
-            <w:pPr>
-              <w:spacing w:before="20" w:after="20"/>
-            </w:pPr>
-            <w:r>
-              <w:rPr>
-                <w:b/>
-              </w:rPr>
-              <w:t xml:space="preserve">Cuándo</w:t>
-            </w:r>
-          </w:p>
-        </w:tc>
-      </w:tr>
-      <w:tr>
-        <w:tc>
-          <w:tcPr>
-            <w:tcW w:w="0" w:type="auto"/>
-          </w:tcPr>
-          <w:p>
-            <w:pPr>
-              <w:spacing w:before="20" w:after="20"/>
-            </w:pPr>
-            <w:r>
-              <w:t xml:space="preserve">EXP-01 Presupuesto de latencia</w:t>
-            </w:r>
-          </w:p>
-        </w:tc>
-        <w:tc>
-          <w:tcPr>
-            <w:tcW w:w="0" w:type="auto"/>
-          </w:tcPr>
-          <w:p>
-            <w:pPr>
-              <w:spacing w:before="20" w:after="20"/>
-            </w:pPr>
-            <w:r>
-              <w:t xml:space="preserve">HU-ARQ-07</w:t>
-            </w:r>
-          </w:p>
-        </w:tc>
-        <w:tc>
-          <w:tcPr>
-            <w:tcW w:w="0" w:type="auto"/>
-          </w:tcPr>
-          <w:p>
-            <w:pPr>
-              <w:spacing w:before="20" w:after="20"/>
-            </w:pPr>
-            <w:r>
-              <w:t xml:space="preserve">ASR-1.1</w:t>
-            </w:r>
-          </w:p>
-        </w:tc>
-        <w:tc>
-          <w:tcPr>
-            <w:tcW w:w="0" w:type="auto"/>
-          </w:tcPr>
-          <w:p>
-            <w:pPr>
-              <w:spacing w:before="20" w:after="20"/>
-            </w:pPr>
-            <w:r>
-              <w:t xml:space="preserve">Alta</w:t>
-            </w:r>
-          </w:p>
-        </w:tc>
-        <w:tc>
-          <w:tcPr>
-            <w:tcW w:w="0" w:type="auto"/>
-          </w:tcPr>
-          <w:p>
-            <w:pPr>
-              <w:spacing w:before="20" w:after="20"/>
-            </w:pPr>
-            <w:r>
-              <w:t xml:space="preserve">10 h</w:t>
-            </w:r>
-          </w:p>
-        </w:tc>
-        <w:tc>
-          <w:tcPr>
-            <w:tcW w:w="0" w:type="auto"/>
-          </w:tcPr>
-          <w:p>
-            <w:pPr>
-              <w:spacing w:before="20" w:after="20"/>
-            </w:pPr>
-            <w:r>
-              <w:t xml:space="preserve">Semana 5</w:t>
-            </w:r>
-          </w:p>
-        </w:tc>
-      </w:tr>
-      <w:tr>
-        <w:tc>
-          <w:tcPr>
-            <w:tcW w:w="0" w:type="auto"/>
-          </w:tcPr>
-          <w:p>
-            <w:pPr>
-              <w:spacing w:before="20" w:after="20"/>
-            </w:pPr>
-            <w:r>
-              <w:t xml:space="preserve">EXP-02 Degradación elegante</w:t>
-            </w:r>
-          </w:p>
-        </w:tc>
-        <w:tc>
-          <w:tcPr>
-            <w:tcW w:w="0" w:type="auto"/>
-          </w:tcPr>
-          <w:p>
-            <w:pPr>
-              <w:spacing w:before="20" w:after="20"/>
-            </w:pPr>
-            <w:r>
-              <w:t xml:space="preserve">HU-ARQ-08</w:t>
-            </w:r>
-          </w:p>
-        </w:tc>
-        <w:tc>
-          <w:tcPr>
-            <w:tcW w:w="0" w:type="auto"/>
-          </w:tcPr>
-          <w:p>
-            <w:pPr>
-              <w:spacing w:before="20" w:after="20"/>
-            </w:pPr>
-            <w:r>
-              <w:t xml:space="preserve">ASR-1.2</w:t>
-            </w:r>
-          </w:p>
-        </w:tc>
-        <w:tc>
-          <w:tcPr>
-            <w:tcW w:w="0" w:type="auto"/>
-          </w:tcPr>
-          <w:p>
-            <w:pPr>
-              <w:spacing w:before="20" w:after="20"/>
-            </w:pPr>
-            <w:r>
-              <w:t xml:space="preserve">Alta</w:t>
-            </w:r>
-          </w:p>
-        </w:tc>
-        <w:tc>
-          <w:tcPr>
-            <w:tcW w:w="0" w:type="auto"/>
-          </w:tcPr>
-          <w:p>
-            <w:pPr>
-              <w:spacing w:before="20" w:after="20"/>
-            </w:pPr>
-            <w:r>
-              <w:t xml:space="preserve">12 h</w:t>
-            </w:r>
-          </w:p>
-        </w:tc>
-        <w:tc>
-          <w:tcPr>
-            <w:tcW w:w="0" w:type="auto"/>
-          </w:tcPr>
-          <w:p>
-            <w:pPr>
-              <w:spacing w:before="20" w:after="20"/>
-            </w:pPr>
-            <w:r>
-              <w:t xml:space="preserve">Semana 5</w:t>
-            </w:r>
-          </w:p>
-        </w:tc>
-      </w:tr>
-      <w:tr>
-        <w:tc>
-          <w:tcPr>
-            <w:tcW w:w="0" w:type="auto"/>
-          </w:tcPr>
-          <w:p>
-            <w:pPr>
-              <w:spacing w:before="20" w:after="20"/>
-            </w:pPr>
-            <w:r>
-              <w:t xml:space="preserve">EXP-03 Caída del caché</w:t>
-            </w:r>
-          </w:p>
-        </w:tc>
-        <w:tc>
-          <w:tcPr>
-            <w:tcW w:w="0" w:type="auto"/>
-          </w:tcPr>
-          <w:p>
-            <w:pPr>
-              <w:spacing w:before="20" w:after="20"/>
-            </w:pPr>
-            <w:r>
-              <w:t xml:space="preserve">HU-ARQ-06</w:t>
-            </w:r>
-          </w:p>
-        </w:tc>
-        <w:tc>
-          <w:tcPr>
-            <w:tcW w:w="0" w:type="auto"/>
-          </w:tcPr>
-          <w:p>
-            <w:pPr>
-              <w:spacing w:before="20" w:after="20"/>
-            </w:pPr>
-            <w:r>
-              <w:t xml:space="preserve">ASR-3.1</w:t>
-            </w:r>
-          </w:p>
-        </w:tc>
-        <w:tc>
-          <w:tcPr>
-            <w:tcW w:w="0" w:type="auto"/>
-          </w:tcPr>
-          <w:p>
-            <w:pPr>
-              <w:spacing w:before="20" w:after="20"/>
-            </w:pPr>
-            <w:r>
-              <w:t xml:space="preserve">Alta</w:t>
-            </w:r>
-          </w:p>
-        </w:tc>
-        <w:tc>
-          <w:tcPr>
-            <w:tcW w:w="0" w:type="auto"/>
-          </w:tcPr>
-          <w:p>
-            <w:pPr>
-              <w:spacing w:before="20" w:after="20"/>
-            </w:pPr>
-            <w:r>
-              <w:t xml:space="preserve">8 h</w:t>
-            </w:r>
-          </w:p>
-        </w:tc>
-        <w:tc>
-          <w:tcPr>
-            <w:tcW w:w="0" w:type="auto"/>
-          </w:tcPr>
-          <w:p>
-            <w:pPr>
-              <w:spacing w:before="20" w:after="20"/>
-            </w:pPr>
-            <w:r>
-              <w:t xml:space="preserve">Semana 6</w:t>
-            </w:r>
-          </w:p>
-        </w:tc>
-      </w:tr>
-      <w:tr>
-        <w:tc>
-          <w:tcPr>
-            <w:tcW w:w="0" w:type="auto"/>
-          </w:tcPr>
-          <w:p>
-            <w:pPr>
-              <w:spacing w:before="20" w:after="20"/>
-            </w:pPr>
-            <w:r>
-              <w:t xml:space="preserve">EXP-04 Tokenización</w:t>
-            </w:r>
-          </w:p>
-        </w:tc>
-        <w:tc>
-          <w:tcPr>
-            <w:tcW w:w="0" w:type="auto"/>
-          </w:tcPr>
-          <w:p>
-            <w:pPr>
-              <w:spacing w:before="20" w:after="20"/>
-            </w:pPr>
-            <w:r>
-              <w:t xml:space="preserve">HU-ARQ-03</w:t>
-            </w:r>
-          </w:p>
-        </w:tc>
-        <w:tc>
-          <w:tcPr>
-            <w:tcW w:w="0" w:type="auto"/>
-          </w:tcPr>
-          <w:p>
-            <w:pPr>
-              <w:spacing w:before="20" w:after="20"/>
-            </w:pPr>
-            <w:r>
-              <w:t xml:space="preserve">ASR-4.1</w:t>
-            </w:r>
-          </w:p>
-        </w:tc>
-        <w:tc>
-          <w:tcPr>
-            <w:tcW w:w="0" w:type="auto"/>
-          </w:tcPr>
-          <w:p>
-            <w:pPr>
-              <w:spacing w:before="20" w:after="20"/>
-            </w:pPr>
-            <w:r>
-              <w:t xml:space="preserve">Alta</w:t>
-            </w:r>
-          </w:p>
-        </w:tc>
-        <w:tc>
-          <w:tcPr>
-            <w:tcW w:w="0" w:type="auto"/>
-          </w:tcPr>
-          <w:p>
-            <w:pPr>
-              <w:spacing w:before="20" w:after="20"/>
-            </w:pPr>
-            <w:r>
-              <w:t xml:space="preserve">12 h</w:t>
-            </w:r>
-          </w:p>
-        </w:tc>
-        <w:tc>
-          <w:tcPr>
-            <w:tcW w:w="0" w:type="auto"/>
-          </w:tcPr>
-          <w:p>
-            <w:pPr>
-              <w:spacing w:before="20" w:after="20"/>
-            </w:pPr>
-            <w:r>
-              <w:t xml:space="preserve">Semana 6</w:t>
-            </w:r>
-          </w:p>
-        </w:tc>
-      </w:tr>
-      <w:tr>
-        <w:tc>
-          <w:tcPr>
-            <w:tcW w:w="0" w:type="auto"/>
-          </w:tcPr>
-          <w:p>
-            <w:pPr>
-              <w:spacing w:before="20" w:after="20"/>
-            </w:pPr>
-            <w:r>
-              <w:rPr>
-                <w:b/>
-              </w:rPr>
-              <w:t xml:space="preserve">Sprint 1 de diseño</w:t>
-            </w:r>
-          </w:p>
-        </w:tc>
-        <w:tc>
-          <w:tcPr>
-            <w:tcW w:w="0" w:type="auto"/>
-          </w:tcPr>
-          <w:p>
-            <w:pPr>
-              <w:spacing w:before="20" w:after="20"/>
-            </w:pPr>
-            <w:r>
-              <w:t/>
-            </w:r>
-          </w:p>
-        </w:tc>
-        <w:tc>
-          <w:tcPr>
-            <w:tcW w:w="0" w:type="auto"/>
-          </w:tcPr>
-          <w:p>
-            <w:pPr>
-              <w:spacing w:before="20" w:after="20"/>
-            </w:pPr>
-            <w:r>
-              <w:t/>
-            </w:r>
-          </w:p>
-        </w:tc>
-        <w:tc>
-          <w:tcPr>
-            <w:tcW w:w="0" w:type="auto"/>
-          </w:tcPr>
-          <w:p>
-            <w:pPr>
-              <w:spacing w:before="20" w:after="20"/>
-            </w:pPr>
-            <w:r>
-              <w:t/>
-            </w:r>
-          </w:p>
-        </w:tc>
-        <w:tc>
-          <w:tcPr>
-            <w:tcW w:w="0" w:type="auto"/>
-          </w:tcPr>
-          <w:p>
-            <w:pPr>
-              <w:spacing w:before="20" w:after="20"/>
-            </w:pPr>
-            <w:r>
-              <w:rPr>
-                <w:b/>
-              </w:rPr>
-              <w:t xml:space="preserve">42 h</w:t>
-            </w:r>
-          </w:p>
-        </w:tc>
-        <w:tc>
-          <w:tcPr>
-            <w:tcW w:w="0" w:type="auto"/>
-          </w:tcPr>
-          <w:p>
-            <w:pPr>
-              <w:spacing w:before="20" w:after="20"/>
-            </w:pPr>
-            <w:r>
-              <w:rPr>
-                <w:b/>
-              </w:rPr>
-              <w:t xml:space="preserve">Semanas 5–6</w:t>
-            </w:r>
-          </w:p>
-        </w:tc>
-      </w:tr>
-      <w:tr>
-        <w:tc>
-          <w:tcPr>
-            <w:tcW w:w="0" w:type="auto"/>
-          </w:tcPr>
-          <w:p>
-            <w:pPr>
-              <w:spacing w:before="20" w:after="20"/>
-            </w:pPr>
-            <w:r>
-              <w:t xml:space="preserve">EXP-05 Pasarela nueva</w:t>
-            </w:r>
-          </w:p>
-        </w:tc>
-        <w:tc>
-          <w:tcPr>
-            <w:tcW w:w="0" w:type="auto"/>
-          </w:tcPr>
-          <w:p>
-            <w:pPr>
-              <w:spacing w:before="20" w:after="20"/>
-            </w:pPr>
-            <w:r>
-              <w:t xml:space="preserve">HU-ARQ-02</w:t>
-            </w:r>
-          </w:p>
-        </w:tc>
-        <w:tc>
-          <w:tcPr>
-            <w:tcW w:w="0" w:type="auto"/>
-          </w:tcPr>
-          <w:p>
-            <w:pPr>
-              <w:spacing w:before="20" w:after="20"/>
-            </w:pPr>
-            <w:r>
-              <w:t xml:space="preserve">ASR-2.1</w:t>
-            </w:r>
-          </w:p>
-        </w:tc>
-        <w:tc>
-          <w:tcPr>
-            <w:tcW w:w="0" w:type="auto"/>
-          </w:tcPr>
-          <w:p>
-            <w:pPr>
-              <w:spacing w:before="20" w:after="20"/>
-            </w:pPr>
-            <w:r>
-              <w:t xml:space="preserve">Media</w:t>
-            </w:r>
-          </w:p>
-        </w:tc>
-        <w:tc>
-          <w:tcPr>
-            <w:tcW w:w="0" w:type="auto"/>
-          </w:tcPr>
-          <w:p>
-            <w:pPr>
-              <w:spacing w:before="20" w:after="20"/>
-            </w:pPr>
-            <w:r>
-              <w:t xml:space="preserve">6 h</w:t>
-            </w:r>
-          </w:p>
-        </w:tc>
-        <w:tc>
-          <w:tcPr>
-            <w:tcW w:w="0" w:type="auto"/>
-          </w:tcPr>
-          <w:p>
-            <w:pPr>
-              <w:spacing w:before="20" w:after="20"/>
-            </w:pPr>
-            <w:r>
-              <w:t xml:space="preserve">Semana 7 si hay holgura</w:t>
-            </w:r>
-          </w:p>
-        </w:tc>
-      </w:tr>
-      <w:tr>
-        <w:tc>
-          <w:tcPr>
-            <w:tcW w:w="0" w:type="auto"/>
-          </w:tcPr>
-          <w:p>
-            <w:pPr>
-              <w:spacing w:before="20" w:after="20"/>
-            </w:pPr>
-            <w:r>
-              <w:t xml:space="preserve">EXP-06 Continuidad offline</w:t>
-            </w:r>
-          </w:p>
-        </w:tc>
-        <w:tc>
-          <w:tcPr>
-            <w:tcW w:w="0" w:type="auto"/>
-          </w:tcPr>
-          <w:p>
-            <w:pPr>
-              <w:spacing w:before="20" w:after="20"/>
-            </w:pPr>
-            <w:r>
-              <w:t xml:space="preserve">HU-ARQ-10</w:t>
-            </w:r>
-          </w:p>
-        </w:tc>
-        <w:tc>
-          <w:tcPr>
-            <w:tcW w:w="0" w:type="auto"/>
-          </w:tcPr>
-          <w:p>
-            <w:pPr>
-              <w:spacing w:before="20" w:after="20"/>
-            </w:pPr>
-            <w:r>
-              <w:t xml:space="preserve">ASR-3.3</w:t>
-            </w:r>
-          </w:p>
-        </w:tc>
-        <w:tc>
-          <w:tcPr>
-            <w:tcW w:w="0" w:type="auto"/>
-          </w:tcPr>
-          <w:p>
-            <w:pPr>
-              <w:spacing w:before="20" w:after="20"/>
-            </w:pPr>
-            <w:r>
-              <w:t xml:space="preserve">Media</w:t>
-            </w:r>
-          </w:p>
-        </w:tc>
-        <w:tc>
-          <w:tcPr>
-            <w:tcW w:w="0" w:type="auto"/>
-          </w:tcPr>
-          <w:p>
-            <w:pPr>
-              <w:spacing w:before="20" w:after="20"/>
-            </w:pPr>
-            <w:r>
-              <w:t xml:space="preserve">10 h</w:t>
-            </w:r>
-          </w:p>
-        </w:tc>
-        <w:tc>
-          <w:tcPr>
-            <w:tcW w:w="0" w:type="auto"/>
-          </w:tcPr>
-          <w:p>
-            <w:pPr>
-              <w:spacing w:before="20" w:after="20"/>
-            </w:pPr>
-            <w:r>
-              <w:t xml:space="preserve">Semana 7 si hay holgura</w:t>
-            </w:r>
-          </w:p>
-        </w:tc>
-      </w:tr>
-      <w:tr>
-        <w:tc>
-          <w:tcPr>
-            <w:tcW w:w="0" w:type="auto"/>
-          </w:tcPr>
-          <w:p>
-            <w:pPr>
-              <w:spacing w:before="20" w:after="20"/>
-            </w:pPr>
-            <w:r>
-              <w:rPr>
-                <w:b/>
-              </w:rPr>
-              <w:t xml:space="preserve">Total del programa</w:t>
-            </w:r>
-          </w:p>
-        </w:tc>
-        <w:tc>
-          <w:tcPr>
-            <w:tcW w:w="0" w:type="auto"/>
-          </w:tcPr>
-          <w:p>
-            <w:pPr>
-              <w:spacing w:before="20" w:after="20"/>
-            </w:pPr>
-            <w:r>
-              <w:t/>
-            </w:r>
-          </w:p>
-        </w:tc>
-        <w:tc>
-          <w:tcPr>
-            <w:tcW w:w="0" w:type="auto"/>
-          </w:tcPr>
-          <w:p>
-            <w:pPr>
-              <w:spacing w:before="20" w:after="20"/>
-            </w:pPr>
-            <w:r>
-              <w:t/>
-            </w:r>
-          </w:p>
-        </w:tc>
-        <w:tc>
-          <w:tcPr>
-            <w:tcW w:w="0" w:type="auto"/>
-          </w:tcPr>
-          <w:p>
-            <w:pPr>
-              <w:spacing w:before="20" w:after="20"/>
-            </w:pPr>
-            <w:r>
-              <w:t/>
-            </w:r>
-          </w:p>
-        </w:tc>
-        <w:tc>
-          <w:tcPr>
-            <w:tcW w:w="0" w:type="auto"/>
-          </w:tcPr>
-          <w:p>
-            <w:pPr>
-              <w:spacing w:before="20" w:after="20"/>
-            </w:pPr>
-            <w:r>
-              <w:rPr>
-                <w:b/>
-              </w:rPr>
-              <w:t xml:space="preserve">58 h</w:t>
-            </w:r>
-          </w:p>
-        </w:tc>
-        <w:tc>
-          <w:tcPr>
-            <w:tcW w:w="0" w:type="auto"/>
-          </w:tcPr>
-          <w:p>
-            <w:pPr>
-              <w:spacing w:before="20" w:after="20"/>
-            </w:pPr>
-            <w:r>
-              <w:t/>
-            </w:r>
-          </w:p>
-        </w:tc>
-      </w:tr>
-    </w:tbl>
-    <w:p>
-      <w:r>
-        <w:t/>
-      </w:r>
-    </w:p>
-    <w:p>
       <w:r>
         <w:t xml:space="preserve">Las 42 horas del Sprint 1 equivalen a 21 puntos de historia con la convención del equipo de 1 punto igual a 2 horas, y están contenidas dentro de los 42 puntos asignados a las historias de arquitectura en el alcance del Proyecto Final 1: construir el mecanismo y ejecutar el experimento que lo valida son parte de la misma historia.</w:t>
       </w:r>
     </w:p>
     <w:p>
       <w:r>
-        <w:t xml:space="preserve">Se descartaron tres experimentos que sí aparecían en versiones anteriores de esta propuesta: el de integridad de pólizas, porque su punto de sensibilidad no genera incertidumbre; y los de ramo nuevo y pérdida de zona, porque su incertidumbre es media y su ejecución depende de infraestructura con costo, por lo que se difieren al Proyecto Final 2.</w:t>
+        <w:t xml:space="preserve">La propuesta se limita a cuatro experimentos por decisión explícita. Se descartó el de integridad de pólizas porque su punto de sensibilidad, el bloqueo de escritura del almacenamiento, es una garantía de plataforma y no genera incertidumbre. Los cuatro restantes —pasarela de pagos, continuidad offline, ramo nuevo por configuración y pérdida de zona— corresponden a puntos de sensibilidad de incertidumbre media cuyo resultado adverso obligaría a ajustar una abstracción y no a rehacer estructura; se difieren al Proyecto Final 2. Experimentar los nueve habría repartido las mismas 42 horas entre el doble de frentes, produciendo mediciones superficiales en todos en lugar de conclusiones firmes en los críticos.</w:t>
       </w:r>
     </w:p>
     <w:p>

</xml_diff>